<commit_message>
Update Block 11 consultant on-call schedule to correct dates and add updated consultant assignments; swap Dr. Shefa/Dr. Khadija on Jul 15 and Jul 23
Co-Authored-By: Claude <noreply@anthropic.com>
</commit_message>
<xml_diff>
--- a/app/block11_template.docx
+++ b/app/block11_template.docx
@@ -10468,7 +10468,7 @@
               </w:rPr>
             </w:pPr>
             <w:r>
-              <w:t>07</w:t>
+              <w:t>05</w:t>
             </w:r>
           </w:p>
         </w:tc>
@@ -10497,7 +10497,7 @@
               </w:rPr>
             </w:pPr>
             <w:r>
-              <w:t>21</w:t>
+              <w:t>20</w:t>
             </w:r>
           </w:p>
         </w:tc>
@@ -10516,7 +10516,7 @@
               <w:jc w:val="center"/>
             </w:pPr>
             <w:r>
-              <w:t xml:space="preserve">Dr. Nesreen </w:t>
+              <w:t xml:space="preserve">Dr. Shefa</w:t>
             </w:r>
           </w:p>
         </w:tc>
@@ -10550,7 +10550,7 @@
                 <w:sz w:val="18"/>
                 <w:szCs w:val="18"/>
               </w:rPr>
-              <w:t>Dr. Ghanima</w:t>
+              <w:t/>
             </w:r>
           </w:p>
         </w:tc>
@@ -10587,7 +10587,7 @@
                 <w:sz w:val="16"/>
                 <w:szCs w:val="16"/>
               </w:rPr>
-              <w:t>Iman – M Owa</w:t>
+              <w:t/>
             </w:r>
           </w:p>
         </w:tc>
@@ -10627,7 +10627,7 @@
                 <w:szCs w:val="16"/>
                 <w14:ligatures w14:val="none"/>
               </w:rPr>
-              <w:t>Dr. Amani</w:t>
+              <w:t/>
             </w:r>
           </w:p>
         </w:tc>
@@ -10692,7 +10692,7 @@
               </w:rPr>
             </w:pPr>
             <w:r>
-              <w:t>08</w:t>
+              <w:t>06</w:t>
             </w:r>
           </w:p>
         </w:tc>
@@ -10721,7 +10721,7 @@
               </w:rPr>
             </w:pPr>
             <w:r>
-              <w:t>22</w:t>
+              <w:t>21</w:t>
             </w:r>
           </w:p>
         </w:tc>
@@ -10740,7 +10740,7 @@
               <w:jc w:val="center"/>
             </w:pPr>
             <w:r>
-              <w:t>Dr. Jenan</w:t>
+              <w:t>Dr. Zainab Alfaraj</w:t>
             </w:r>
           </w:p>
         </w:tc>
@@ -10771,7 +10771,7 @@
                 <w:sz w:val="18"/>
                 <w:szCs w:val="18"/>
               </w:rPr>
-              <w:t>Dr. Ghanima</w:t>
+              <w:t/>
             </w:r>
           </w:p>
         </w:tc>
@@ -10808,7 +10808,7 @@
                 <w:sz w:val="16"/>
                 <w:szCs w:val="16"/>
               </w:rPr>
-              <w:t>Iman – M Owa</w:t>
+              <w:t/>
             </w:r>
           </w:p>
         </w:tc>
@@ -10848,7 +10848,7 @@
                 <w:szCs w:val="16"/>
                 <w14:ligatures w14:val="none"/>
               </w:rPr>
-              <w:t>Dr. F. Alfaraj</w:t>
+              <w:t/>
             </w:r>
           </w:p>
         </w:tc>
@@ -10913,7 +10913,7 @@
               </w:rPr>
             </w:pPr>
             <w:r>
-              <w:t>09</w:t>
+              <w:t>07</w:t>
             </w:r>
           </w:p>
         </w:tc>
@@ -10942,7 +10942,7 @@
               </w:rPr>
             </w:pPr>
             <w:r>
-              <w:t>23</w:t>
+              <w:t>22</w:t>
             </w:r>
           </w:p>
         </w:tc>
@@ -10961,7 +10961,7 @@
               <w:jc w:val="center"/>
             </w:pPr>
             <w:r>
-              <w:t>Dr. Ali Alramadhan</w:t>
+              <w:t>Dr. Fatimah Alrebh</w:t>
             </w:r>
           </w:p>
         </w:tc>
@@ -10992,7 +10992,7 @@
                 <w:sz w:val="18"/>
                 <w:szCs w:val="18"/>
               </w:rPr>
-              <w:t xml:space="preserve">Dr. Ghanima </w:t>
+              <w:t xml:space="preserve"/>
             </w:r>
           </w:p>
         </w:tc>
@@ -11029,7 +11029,7 @@
                 <w:sz w:val="16"/>
                 <w:szCs w:val="16"/>
               </w:rPr>
-              <w:t>Iman – M Owa</w:t>
+              <w:t/>
             </w:r>
           </w:p>
         </w:tc>
@@ -11069,7 +11069,7 @@
                 <w:szCs w:val="16"/>
                 <w14:ligatures w14:val="none"/>
               </w:rPr>
-              <w:t>Dr. Abdulrahim</w:t>
+              <w:t/>
             </w:r>
           </w:p>
         </w:tc>
@@ -11134,7 +11134,7 @@
               </w:rPr>
             </w:pPr>
             <w:r>
-              <w:t>10</w:t>
+              <w:t>08</w:t>
             </w:r>
           </w:p>
         </w:tc>
@@ -11163,7 +11163,7 @@
               </w:rPr>
             </w:pPr>
             <w:r>
-              <w:t>24</w:t>
+              <w:t>23</w:t>
             </w:r>
           </w:p>
         </w:tc>
@@ -11182,11 +11182,11 @@
               <w:jc w:val="center"/>
             </w:pPr>
             <w:r>
-              <w:t xml:space="preserve">Dr. Fatimah </w:t>
+              <w:t xml:space="preserve">Dr. Hani</w:t>
             </w:r>
             <w:proofErr w:type="spellStart"/>
             <w:r>
-              <w:t>Alsinan</w:t>
+              <w:t/>
             </w:r>
             <w:proofErr w:type="spellEnd"/>
           </w:p>
@@ -11218,7 +11218,7 @@
                 <w:sz w:val="18"/>
                 <w:szCs w:val="18"/>
               </w:rPr>
-              <w:t>Dr. Ghanima</w:t>
+              <w:t/>
             </w:r>
           </w:p>
         </w:tc>
@@ -11255,7 +11255,7 @@
                 <w:sz w:val="16"/>
                 <w:szCs w:val="16"/>
               </w:rPr>
-              <w:t>Iman – M Owa</w:t>
+              <w:t/>
             </w:r>
           </w:p>
         </w:tc>
@@ -11295,7 +11295,7 @@
                 <w:szCs w:val="16"/>
                 <w14:ligatures w14:val="none"/>
               </w:rPr>
-              <w:t>Dr. F. Alfaraj</w:t>
+              <w:t/>
             </w:r>
           </w:p>
         </w:tc>
@@ -11360,7 +11360,7 @@
               </w:rPr>
             </w:pPr>
             <w:r>
-              <w:t>11</w:t>
+              <w:t>09</w:t>
             </w:r>
           </w:p>
         </w:tc>
@@ -11389,7 +11389,7 @@
               </w:rPr>
             </w:pPr>
             <w:r>
-              <w:t>25</w:t>
+              <w:t>24</w:t>
             </w:r>
           </w:p>
         </w:tc>
@@ -11408,11 +11408,11 @@
               <w:jc w:val="center"/>
             </w:pPr>
             <w:r>
-              <w:t xml:space="preserve">Dr. Zahra </w:t>
+              <w:t xml:space="preserve">Dr. Ali Alramdhan</w:t>
             </w:r>
             <w:proofErr w:type="spellStart"/>
             <w:r>
-              <w:t>Alsanaa</w:t>
+              <w:t/>
             </w:r>
             <w:proofErr w:type="spellEnd"/>
           </w:p>
@@ -11444,7 +11444,7 @@
                 <w:sz w:val="18"/>
                 <w:szCs w:val="18"/>
               </w:rPr>
-              <w:t>Dr. Ghanima</w:t>
+              <w:t/>
             </w:r>
           </w:p>
         </w:tc>
@@ -11481,7 +11481,7 @@
                 <w:sz w:val="16"/>
                 <w:szCs w:val="16"/>
               </w:rPr>
-              <w:t>Iman</w:t>
+              <w:t/>
             </w:r>
           </w:p>
         </w:tc>
@@ -11521,7 +11521,7 @@
                 <w:szCs w:val="16"/>
                 <w14:ligatures w14:val="none"/>
               </w:rPr>
-              <w:t>Dr. M. Alsultan</w:t>
+              <w:t/>
             </w:r>
           </w:p>
         </w:tc>
@@ -11589,7 +11589,7 @@
               </w:rPr>
             </w:pPr>
             <w:r>
-              <w:t>12</w:t>
+              <w:t>10</w:t>
             </w:r>
           </w:p>
         </w:tc>
@@ -11619,7 +11619,7 @@
               </w:rPr>
             </w:pPr>
             <w:r>
-              <w:t>26</w:t>
+              <w:t>25</w:t>
             </w:r>
           </w:p>
         </w:tc>
@@ -11639,11 +11639,11 @@
               <w:jc w:val="center"/>
             </w:pPr>
             <w:r>
-              <w:t xml:space="preserve">Dr. Zahra </w:t>
+              <w:t xml:space="preserve">Dr. Hani</w:t>
             </w:r>
             <w:proofErr w:type="spellStart"/>
             <w:r>
-              <w:t>Alsanaa</w:t>
+              <w:t/>
             </w:r>
             <w:proofErr w:type="spellEnd"/>
           </w:p>
@@ -11676,7 +11676,7 @@
                 <w:sz w:val="18"/>
                 <w:szCs w:val="18"/>
               </w:rPr>
-              <w:t>Dr. Ghanima</w:t>
+              <w:t/>
             </w:r>
           </w:p>
         </w:tc>
@@ -11714,7 +11714,7 @@
                 <w:sz w:val="16"/>
                 <w:szCs w:val="16"/>
               </w:rPr>
-              <w:t>Iman</w:t>
+              <w:t/>
             </w:r>
           </w:p>
         </w:tc>
@@ -11813,7 +11813,7 @@
               </w:rPr>
             </w:pPr>
             <w:r>
-              <w:t>13</w:t>
+              <w:t>11</w:t>
             </w:r>
           </w:p>
         </w:tc>
@@ -11843,7 +11843,7 @@
               </w:rPr>
             </w:pPr>
             <w:r>
-              <w:t>27</w:t>
+              <w:t>26</w:t>
             </w:r>
           </w:p>
         </w:tc>
@@ -11863,7 +11863,7 @@
               <w:jc w:val="center"/>
             </w:pPr>
             <w:r>
-              <w:t>Dr. Hani</w:t>
+              <w:t>Dr. Zakya</w:t>
             </w:r>
           </w:p>
         </w:tc>
@@ -11895,7 +11895,7 @@
                 <w:sz w:val="18"/>
                 <w:szCs w:val="18"/>
               </w:rPr>
-              <w:t>Dr. Ghanima</w:t>
+              <w:t/>
             </w:r>
           </w:p>
         </w:tc>
@@ -11933,7 +11933,7 @@
                 <w:sz w:val="16"/>
                 <w:szCs w:val="16"/>
               </w:rPr>
-              <w:t>Iman</w:t>
+              <w:t/>
             </w:r>
           </w:p>
         </w:tc>
@@ -11973,7 +11973,7 @@
                 <w:szCs w:val="16"/>
                 <w14:ligatures w14:val="none"/>
               </w:rPr>
-              <w:t>Dr. Amani</w:t>
+              <w:t/>
             </w:r>
           </w:p>
         </w:tc>
@@ -12038,7 +12038,7 @@
               </w:rPr>
             </w:pPr>
             <w:r>
-              <w:t>14</w:t>
+              <w:t>12</w:t>
             </w:r>
           </w:p>
         </w:tc>
@@ -12067,7 +12067,7 @@
               </w:rPr>
             </w:pPr>
             <w:r>
-              <w:t>28</w:t>
+              <w:t>27</w:t>
             </w:r>
           </w:p>
         </w:tc>
@@ -12086,7 +12086,7 @@
               <w:jc w:val="center"/>
             </w:pPr>
             <w:r>
-              <w:t>Dr. Hani</w:t>
+              <w:t>Dr. Zakya</w:t>
             </w:r>
           </w:p>
         </w:tc>
@@ -12121,17 +12121,17 @@
                 <w:szCs w:val="16"/>
                 <w14:ligatures w14:val="none"/>
               </w:rPr>
-              <w:t>Dr.</w:t>
-            </w:r>
-            <w:r>
-              <w:rPr>
-                <w:rFonts w:ascii="Times New Roman" w:eastAsia="Times New Roman" w:hAnsi="Times New Roman" w:cs="Times New Roman"/>
-                <w:kern w:val="0"/>
-                <w:sz w:val="16"/>
-                <w:szCs w:val="16"/>
-                <w14:ligatures w14:val="none"/>
-              </w:rPr>
-              <w:t xml:space="preserve"> Mai</w:t>
+              <w:t/>
+            </w:r>
+            <w:r>
+              <w:rPr>
+                <w:rFonts w:ascii="Times New Roman" w:eastAsia="Times New Roman" w:hAnsi="Times New Roman" w:cs="Times New Roman"/>
+                <w:kern w:val="0"/>
+                <w:sz w:val="16"/>
+                <w:szCs w:val="16"/>
+                <w14:ligatures w14:val="none"/>
+              </w:rPr>
+              <w:t xml:space="preserve"/>
             </w:r>
           </w:p>
         </w:tc>
@@ -12169,7 +12169,7 @@
                 <w:szCs w:val="16"/>
                 <w14:ligatures w14:val="none"/>
               </w:rPr>
-              <w:t>Mohammed S</w:t>
+              <w:t/>
             </w:r>
           </w:p>
         </w:tc>
@@ -12207,7 +12207,7 @@
                 <w:szCs w:val="16"/>
                 <w14:ligatures w14:val="none"/>
               </w:rPr>
-              <w:t>Fadel</w:t>
+              <w:t/>
             </w:r>
           </w:p>
         </w:tc>
@@ -12245,7 +12245,7 @@
                 <w:szCs w:val="16"/>
                 <w14:ligatures w14:val="none"/>
               </w:rPr>
-              <w:t>Iman</w:t>
+              <w:t/>
             </w:r>
           </w:p>
         </w:tc>
@@ -12284,7 +12284,7 @@
                 <w:szCs w:val="16"/>
                 <w14:ligatures w14:val="none"/>
               </w:rPr>
-              <w:t>Fatimah</w:t>
+              <w:t/>
             </w:r>
           </w:p>
         </w:tc>
@@ -12323,7 +12323,7 @@
                 <w:szCs w:val="16"/>
                 <w14:ligatures w14:val="none"/>
               </w:rPr>
-              <w:t>Sadiq</w:t>
+              <w:t/>
             </w:r>
           </w:p>
         </w:tc>
@@ -12388,7 +12388,7 @@
               </w:rPr>
             </w:pPr>
             <w:r>
-              <w:t>15</w:t>
+              <w:t>13</w:t>
             </w:r>
           </w:p>
         </w:tc>
@@ -12417,7 +12417,7 @@
               </w:rPr>
             </w:pPr>
             <w:r>
-              <w:t>29</w:t>
+              <w:t>28</w:t>
             </w:r>
           </w:p>
         </w:tc>
@@ -12436,7 +12436,7 @@
               <w:jc w:val="center"/>
             </w:pPr>
             <w:r>
-              <w:t>Dr. Samar</w:t>
+              <w:t>Dr. Jenan</w:t>
             </w:r>
           </w:p>
         </w:tc>
@@ -12471,17 +12471,17 @@
                 <w:szCs w:val="16"/>
                 <w14:ligatures w14:val="none"/>
               </w:rPr>
-              <w:t>Dr.</w:t>
-            </w:r>
-            <w:r>
-              <w:rPr>
-                <w:rFonts w:ascii="Times New Roman" w:eastAsia="Times New Roman" w:hAnsi="Times New Roman" w:cs="Times New Roman"/>
-                <w:kern w:val="0"/>
-                <w:sz w:val="16"/>
-                <w:szCs w:val="16"/>
-                <w14:ligatures w14:val="none"/>
-              </w:rPr>
-              <w:t xml:space="preserve"> Mai</w:t>
+              <w:t/>
+            </w:r>
+            <w:r>
+              <w:rPr>
+                <w:rFonts w:ascii="Times New Roman" w:eastAsia="Times New Roman" w:hAnsi="Times New Roman" w:cs="Times New Roman"/>
+                <w:kern w:val="0"/>
+                <w:sz w:val="16"/>
+                <w:szCs w:val="16"/>
+                <w14:ligatures w14:val="none"/>
+              </w:rPr>
+              <w:t xml:space="preserve"/>
             </w:r>
           </w:p>
         </w:tc>
@@ -12519,7 +12519,7 @@
                 <w:szCs w:val="16"/>
                 <w14:ligatures w14:val="none"/>
               </w:rPr>
-              <w:t>Mohammed S</w:t>
+              <w:t/>
             </w:r>
           </w:p>
         </w:tc>
@@ -12557,7 +12557,7 @@
                 <w:szCs w:val="16"/>
                 <w14:ligatures w14:val="none"/>
               </w:rPr>
-              <w:t>Fadel</w:t>
+              <w:t/>
             </w:r>
           </w:p>
         </w:tc>
@@ -12595,7 +12595,7 @@
                 <w:szCs w:val="16"/>
                 <w14:ligatures w14:val="none"/>
               </w:rPr>
-              <w:t>Saeed</w:t>
+              <w:t/>
             </w:r>
           </w:p>
         </w:tc>
@@ -12634,7 +12634,7 @@
                 <w:szCs w:val="16"/>
                 <w14:ligatures w14:val="none"/>
               </w:rPr>
-              <w:t>Fatimah</w:t>
+              <w:t/>
             </w:r>
           </w:p>
         </w:tc>
@@ -12673,7 +12673,7 @@
                 <w:szCs w:val="16"/>
                 <w14:ligatures w14:val="none"/>
               </w:rPr>
-              <w:t>Abdulrahim</w:t>
+              <w:t/>
             </w:r>
           </w:p>
         </w:tc>
@@ -12738,7 +12738,7 @@
               </w:rPr>
             </w:pPr>
             <w:r>
-              <w:t>16</w:t>
+              <w:t>14</w:t>
             </w:r>
           </w:p>
         </w:tc>
@@ -12767,7 +12767,7 @@
               </w:rPr>
             </w:pPr>
             <w:r>
-              <w:t>01</w:t>
+              <w:t>29</w:t>
             </w:r>
           </w:p>
         </w:tc>
@@ -12786,11 +12786,11 @@
               <w:jc w:val="center"/>
             </w:pPr>
             <w:r>
-              <w:t xml:space="preserve">Dr. Fatimah </w:t>
+              <w:t xml:space="preserve">Dr. Fatimah Alsinan</w:t>
             </w:r>
             <w:proofErr w:type="spellStart"/>
             <w:r>
-              <w:t>Alsinan</w:t>
+              <w:t/>
             </w:r>
             <w:proofErr w:type="spellEnd"/>
           </w:p>
@@ -12826,17 +12826,17 @@
                 <w:szCs w:val="16"/>
                 <w14:ligatures w14:val="none"/>
               </w:rPr>
-              <w:t>Dr.</w:t>
-            </w:r>
-            <w:r>
-              <w:rPr>
-                <w:rFonts w:ascii="Times New Roman" w:eastAsia="Times New Roman" w:hAnsi="Times New Roman" w:cs="Times New Roman"/>
-                <w:kern w:val="0"/>
-                <w:sz w:val="16"/>
-                <w:szCs w:val="16"/>
-                <w14:ligatures w14:val="none"/>
-              </w:rPr>
-              <w:t xml:space="preserve"> Mai</w:t>
+              <w:t/>
+            </w:r>
+            <w:r>
+              <w:rPr>
+                <w:rFonts w:ascii="Times New Roman" w:eastAsia="Times New Roman" w:hAnsi="Times New Roman" w:cs="Times New Roman"/>
+                <w:kern w:val="0"/>
+                <w:sz w:val="16"/>
+                <w:szCs w:val="16"/>
+                <w14:ligatures w14:val="none"/>
+              </w:rPr>
+              <w:t xml:space="preserve"/>
             </w:r>
           </w:p>
         </w:tc>
@@ -12874,7 +12874,7 @@
                 <w:szCs w:val="16"/>
                 <w14:ligatures w14:val="none"/>
               </w:rPr>
-              <w:t>Mohammed S</w:t>
+              <w:t/>
             </w:r>
           </w:p>
         </w:tc>
@@ -12912,7 +12912,7 @@
                 <w:szCs w:val="16"/>
                 <w14:ligatures w14:val="none"/>
               </w:rPr>
-              <w:t>Fadel</w:t>
+              <w:t/>
             </w:r>
           </w:p>
         </w:tc>
@@ -12950,7 +12950,7 @@
                 <w:szCs w:val="16"/>
                 <w14:ligatures w14:val="none"/>
               </w:rPr>
-              <w:t>Iman</w:t>
+              <w:t/>
             </w:r>
           </w:p>
         </w:tc>
@@ -12989,7 +12989,7 @@
                 <w:szCs w:val="16"/>
                 <w14:ligatures w14:val="none"/>
               </w:rPr>
-              <w:t>Amani</w:t>
+              <w:t/>
             </w:r>
           </w:p>
         </w:tc>
@@ -13028,7 +13028,7 @@
                 <w:szCs w:val="16"/>
                 <w14:ligatures w14:val="none"/>
               </w:rPr>
-              <w:t>Sadiq</w:t>
+              <w:t/>
             </w:r>
           </w:p>
         </w:tc>
@@ -13093,7 +13093,7 @@
               </w:rPr>
             </w:pPr>
             <w:r>
-              <w:t>17</w:t>
+              <w:t>15</w:t>
             </w:r>
           </w:p>
         </w:tc>
@@ -13122,7 +13122,7 @@
               </w:rPr>
             </w:pPr>
             <w:r>
-              <w:t>02</w:t>
+              <w:t>30</w:t>
             </w:r>
           </w:p>
         </w:tc>
@@ -13141,7 +13141,7 @@
               <w:jc w:val="center"/>
             </w:pPr>
             <w:r>
-              <w:t>Dr. Jenan</w:t>
+              <w:t>Dr. Khadija</w:t>
             </w:r>
           </w:p>
         </w:tc>
@@ -13176,17 +13176,17 @@
                 <w:szCs w:val="16"/>
                 <w14:ligatures w14:val="none"/>
               </w:rPr>
-              <w:t>Dr.</w:t>
-            </w:r>
-            <w:r>
-              <w:rPr>
-                <w:rFonts w:ascii="Times New Roman" w:eastAsia="Times New Roman" w:hAnsi="Times New Roman" w:cs="Times New Roman"/>
-                <w:kern w:val="0"/>
-                <w:sz w:val="16"/>
-                <w:szCs w:val="16"/>
-                <w14:ligatures w14:val="none"/>
-              </w:rPr>
-              <w:t xml:space="preserve"> Mai</w:t>
+              <w:t/>
+            </w:r>
+            <w:r>
+              <w:rPr>
+                <w:rFonts w:ascii="Times New Roman" w:eastAsia="Times New Roman" w:hAnsi="Times New Roman" w:cs="Times New Roman"/>
+                <w:kern w:val="0"/>
+                <w:sz w:val="16"/>
+                <w:szCs w:val="16"/>
+                <w14:ligatures w14:val="none"/>
+              </w:rPr>
+              <w:t xml:space="preserve"/>
             </w:r>
           </w:p>
         </w:tc>
@@ -13224,7 +13224,7 @@
                 <w:szCs w:val="16"/>
                 <w14:ligatures w14:val="none"/>
               </w:rPr>
-              <w:t>Mohammed S</w:t>
+              <w:t/>
             </w:r>
           </w:p>
         </w:tc>
@@ -13262,7 +13262,7 @@
                 <w:szCs w:val="16"/>
                 <w14:ligatures w14:val="none"/>
               </w:rPr>
-              <w:t>Fadel</w:t>
+              <w:t/>
             </w:r>
           </w:p>
         </w:tc>
@@ -13300,7 +13300,7 @@
                 <w:szCs w:val="16"/>
                 <w14:ligatures w14:val="none"/>
               </w:rPr>
-              <w:t>Saeed</w:t>
+              <w:t/>
             </w:r>
           </w:p>
         </w:tc>
@@ -13339,7 +13339,7 @@
                 <w:szCs w:val="16"/>
                 <w14:ligatures w14:val="none"/>
               </w:rPr>
-              <w:t>Fatimah</w:t>
+              <w:t/>
             </w:r>
           </w:p>
         </w:tc>
@@ -13378,7 +13378,7 @@
                 <w:szCs w:val="16"/>
                 <w14:ligatures w14:val="none"/>
               </w:rPr>
-              <w:t>Abdulrahim</w:t>
+              <w:t/>
             </w:r>
           </w:p>
         </w:tc>
@@ -13443,7 +13443,7 @@
               </w:rPr>
             </w:pPr>
             <w:r>
-              <w:t>18</w:t>
+              <w:t>16</w:t>
             </w:r>
           </w:p>
         </w:tc>
@@ -13472,7 +13472,7 @@
               </w:rPr>
             </w:pPr>
             <w:r>
-              <w:t>03</w:t>
+              <w:t>01</w:t>
             </w:r>
           </w:p>
         </w:tc>
@@ -13526,17 +13526,17 @@
                 <w:szCs w:val="16"/>
                 <w14:ligatures w14:val="none"/>
               </w:rPr>
-              <w:t>Dr.</w:t>
-            </w:r>
-            <w:r>
-              <w:rPr>
-                <w:rFonts w:ascii="Times New Roman" w:eastAsia="Times New Roman" w:hAnsi="Times New Roman" w:cs="Times New Roman"/>
-                <w:kern w:val="0"/>
-                <w:sz w:val="16"/>
-                <w:szCs w:val="16"/>
-                <w14:ligatures w14:val="none"/>
-              </w:rPr>
-              <w:t xml:space="preserve"> Mai</w:t>
+              <w:t/>
+            </w:r>
+            <w:r>
+              <w:rPr>
+                <w:rFonts w:ascii="Times New Roman" w:eastAsia="Times New Roman" w:hAnsi="Times New Roman" w:cs="Times New Roman"/>
+                <w:kern w:val="0"/>
+                <w:sz w:val="16"/>
+                <w:szCs w:val="16"/>
+                <w14:ligatures w14:val="none"/>
+              </w:rPr>
+              <w:t xml:space="preserve"/>
             </w:r>
           </w:p>
         </w:tc>
@@ -13574,7 +13574,7 @@
                 <w:szCs w:val="16"/>
                 <w14:ligatures w14:val="none"/>
               </w:rPr>
-              <w:t>Mohammed S</w:t>
+              <w:t/>
             </w:r>
           </w:p>
         </w:tc>
@@ -13612,7 +13612,7 @@
                 <w:szCs w:val="16"/>
                 <w14:ligatures w14:val="none"/>
               </w:rPr>
-              <w:t>Fadel</w:t>
+              <w:t/>
             </w:r>
           </w:p>
         </w:tc>
@@ -13650,7 +13650,7 @@
                 <w:szCs w:val="16"/>
                 <w14:ligatures w14:val="none"/>
               </w:rPr>
-              <w:t>Iman</w:t>
+              <w:t/>
             </w:r>
           </w:p>
         </w:tc>
@@ -13689,7 +13689,7 @@
                 <w:szCs w:val="16"/>
                 <w14:ligatures w14:val="none"/>
               </w:rPr>
-              <w:t>AlSultan</w:t>
+              <w:t/>
             </w:r>
           </w:p>
         </w:tc>
@@ -13728,7 +13728,7 @@
                 <w:szCs w:val="16"/>
                 <w14:ligatures w14:val="none"/>
               </w:rPr>
-              <w:t>Amani</w:t>
+              <w:t/>
             </w:r>
           </w:p>
         </w:tc>
@@ -13796,7 +13796,7 @@
               </w:rPr>
             </w:pPr>
             <w:r>
-              <w:t>19</w:t>
+              <w:t>17</w:t>
             </w:r>
           </w:p>
         </w:tc>
@@ -13826,7 +13826,7 @@
               </w:rPr>
             </w:pPr>
             <w:r>
-              <w:t>04</w:t>
+              <w:t>02</w:t>
             </w:r>
           </w:p>
         </w:tc>
@@ -13846,7 +13846,7 @@
               <w:jc w:val="center"/>
             </w:pPr>
             <w:r>
-              <w:t>Dr. Samar</w:t>
+              <w:t>Dr. Jenan</w:t>
             </w:r>
           </w:p>
         </w:tc>
@@ -13883,17 +13883,17 @@
                 <w:szCs w:val="16"/>
                 <w14:ligatures w14:val="none"/>
               </w:rPr>
-              <w:t>Dr.</w:t>
-            </w:r>
-            <w:r>
-              <w:rPr>
-                <w:rFonts w:ascii="Times New Roman" w:eastAsia="Times New Roman" w:hAnsi="Times New Roman" w:cs="Times New Roman"/>
-                <w:kern w:val="0"/>
-                <w:sz w:val="16"/>
-                <w:szCs w:val="16"/>
-                <w14:ligatures w14:val="none"/>
-              </w:rPr>
-              <w:t xml:space="preserve"> Mai</w:t>
+              <w:t/>
+            </w:r>
+            <w:r>
+              <w:rPr>
+                <w:rFonts w:ascii="Times New Roman" w:eastAsia="Times New Roman" w:hAnsi="Times New Roman" w:cs="Times New Roman"/>
+                <w:kern w:val="0"/>
+                <w:sz w:val="16"/>
+                <w:szCs w:val="16"/>
+                <w14:ligatures w14:val="none"/>
+              </w:rPr>
+              <w:t xml:space="preserve"/>
             </w:r>
           </w:p>
         </w:tc>
@@ -13933,7 +13933,7 @@
                 <w:szCs w:val="16"/>
                 <w14:ligatures w14:val="none"/>
               </w:rPr>
-              <w:t>Mohammed S</w:t>
+              <w:t/>
             </w:r>
           </w:p>
         </w:tc>
@@ -14003,7 +14003,7 @@
                 <w:szCs w:val="16"/>
                 <w14:ligatures w14:val="none"/>
               </w:rPr>
-              <w:t>Saeed</w:t>
+              <w:t/>
             </w:r>
           </w:p>
         </w:tc>
@@ -14075,7 +14075,7 @@
                 <w:szCs w:val="16"/>
                 <w14:ligatures w14:val="none"/>
               </w:rPr>
-              <w:t>AlSultan</w:t>
+              <w:t/>
             </w:r>
           </w:p>
         </w:tc>
@@ -14143,7 +14143,7 @@
               </w:rPr>
             </w:pPr>
             <w:r>
-              <w:t>20</w:t>
+              <w:t>18</w:t>
             </w:r>
           </w:p>
         </w:tc>
@@ -14173,7 +14173,7 @@
               </w:rPr>
             </w:pPr>
             <w:r>
-              <w:t>05</w:t>
+              <w:t>03</w:t>
             </w:r>
           </w:p>
         </w:tc>
@@ -14193,7 +14193,7 @@
               <w:jc w:val="center"/>
             </w:pPr>
             <w:r>
-              <w:t>Dr. Samar</w:t>
+              <w:t>Dr. Zainab Alfaraj</w:t>
             </w:r>
           </w:p>
         </w:tc>
@@ -14229,17 +14229,17 @@
                 <w:szCs w:val="16"/>
                 <w14:ligatures w14:val="none"/>
               </w:rPr>
-              <w:t>Dr.</w:t>
-            </w:r>
-            <w:r>
-              <w:rPr>
-                <w:rFonts w:ascii="Times New Roman" w:eastAsia="Times New Roman" w:hAnsi="Times New Roman" w:cs="Times New Roman"/>
-                <w:kern w:val="0"/>
-                <w:sz w:val="16"/>
-                <w:szCs w:val="16"/>
-                <w14:ligatures w14:val="none"/>
-              </w:rPr>
-              <w:t xml:space="preserve"> Mai</w:t>
+              <w:t/>
+            </w:r>
+            <w:r>
+              <w:rPr>
+                <w:rFonts w:ascii="Times New Roman" w:eastAsia="Times New Roman" w:hAnsi="Times New Roman" w:cs="Times New Roman"/>
+                <w:kern w:val="0"/>
+                <w:sz w:val="16"/>
+                <w:szCs w:val="16"/>
+                <w14:ligatures w14:val="none"/>
+              </w:rPr>
+              <w:t xml:space="preserve"/>
             </w:r>
           </w:p>
         </w:tc>
@@ -14277,7 +14277,7 @@
                 <w:szCs w:val="16"/>
                 <w14:ligatures w14:val="none"/>
               </w:rPr>
-              <w:t>Mohammed S</w:t>
+              <w:t/>
             </w:r>
           </w:p>
         </w:tc>
@@ -14343,7 +14343,7 @@
                 <w:szCs w:val="16"/>
                 <w14:ligatures w14:val="none"/>
               </w:rPr>
-              <w:t>Iman</w:t>
+              <w:t/>
             </w:r>
           </w:p>
         </w:tc>
@@ -14413,7 +14413,7 @@
                 <w:szCs w:val="16"/>
                 <w14:ligatures w14:val="none"/>
               </w:rPr>
-              <w:t>Fatimah (3 PM-11PM)</w:t>
+              <w:t/>
             </w:r>
           </w:p>
         </w:tc>
@@ -14478,7 +14478,7 @@
               </w:rPr>
             </w:pPr>
             <w:r>
-              <w:t>21</w:t>
+              <w:t>19</w:t>
             </w:r>
           </w:p>
         </w:tc>
@@ -14507,7 +14507,7 @@
               </w:rPr>
             </w:pPr>
             <w:r>
-              <w:t>06</w:t>
+              <w:t>04</w:t>
             </w:r>
           </w:p>
         </w:tc>
@@ -14526,7 +14526,7 @@
               <w:jc w:val="center"/>
             </w:pPr>
             <w:r>
-              <w:t>Dr. Hani</w:t>
+              <w:t>Dr. Mona</w:t>
             </w:r>
           </w:p>
         </w:tc>
@@ -14561,17 +14561,17 @@
                 <w:szCs w:val="16"/>
                 <w14:ligatures w14:val="none"/>
               </w:rPr>
-              <w:t>Dr.</w:t>
-            </w:r>
-            <w:r>
-              <w:rPr>
-                <w:rFonts w:ascii="Times New Roman" w:eastAsia="Times New Roman" w:hAnsi="Times New Roman" w:cs="Times New Roman"/>
-                <w:kern w:val="0"/>
-                <w:sz w:val="16"/>
-                <w:szCs w:val="16"/>
-                <w14:ligatures w14:val="none"/>
-              </w:rPr>
-              <w:t xml:space="preserve"> Aminah</w:t>
+              <w:t/>
+            </w:r>
+            <w:r>
+              <w:rPr>
+                <w:rFonts w:ascii="Times New Roman" w:eastAsia="Times New Roman" w:hAnsi="Times New Roman" w:cs="Times New Roman"/>
+                <w:kern w:val="0"/>
+                <w:sz w:val="16"/>
+                <w:szCs w:val="16"/>
+                <w14:ligatures w14:val="none"/>
+              </w:rPr>
+              <w:t xml:space="preserve"/>
             </w:r>
           </w:p>
         </w:tc>
@@ -14610,7 +14610,7 @@
                 <w:szCs w:val="16"/>
                 <w14:ligatures w14:val="none"/>
               </w:rPr>
-              <w:t>Abdullah</w:t>
+              <w:t/>
             </w:r>
           </w:p>
         </w:tc>
@@ -14649,7 +14649,7 @@
                 <w:szCs w:val="16"/>
                 <w14:ligatures w14:val="none"/>
               </w:rPr>
-              <w:t>Mohammed O</w:t>
+              <w:t/>
             </w:r>
           </w:p>
         </w:tc>
@@ -14688,7 +14688,7 @@
                 <w:szCs w:val="16"/>
                 <w14:ligatures w14:val="none"/>
               </w:rPr>
-              <w:t>Saeed</w:t>
+              <w:t/>
             </w:r>
           </w:p>
         </w:tc>
@@ -14727,7 +14727,7 @@
                 <w:szCs w:val="16"/>
                 <w14:ligatures w14:val="none"/>
               </w:rPr>
-              <w:t>AlSultan</w:t>
+              <w:t/>
             </w:r>
           </w:p>
         </w:tc>
@@ -14766,7 +14766,7 @@
                 <w:szCs w:val="16"/>
                 <w14:ligatures w14:val="none"/>
               </w:rPr>
-              <w:t>Sadiq</w:t>
+              <w:t/>
             </w:r>
           </w:p>
         </w:tc>
@@ -14831,7 +14831,7 @@
               </w:rPr>
             </w:pPr>
             <w:r>
-              <w:t>22</w:t>
+              <w:t>20</w:t>
             </w:r>
           </w:p>
         </w:tc>
@@ -14860,7 +14860,7 @@
               </w:rPr>
             </w:pPr>
             <w:r>
-              <w:t>07</w:t>
+              <w:t>05</w:t>
             </w:r>
           </w:p>
         </w:tc>
@@ -14879,7 +14879,7 @@
               <w:jc w:val="center"/>
             </w:pPr>
             <w:r>
-              <w:t>Dr. Hani</w:t>
+              <w:t>Dr. Zainab Alfaraj</w:t>
             </w:r>
           </w:p>
         </w:tc>
@@ -14916,17 +14916,17 @@
                 <w:szCs w:val="16"/>
                 <w14:ligatures w14:val="none"/>
               </w:rPr>
-              <w:t>Dr.</w:t>
-            </w:r>
-            <w:r>
-              <w:rPr>
-                <w:rFonts w:ascii="Times New Roman" w:eastAsia="Times New Roman" w:hAnsi="Times New Roman" w:cs="Times New Roman"/>
-                <w:kern w:val="0"/>
-                <w:sz w:val="16"/>
-                <w:szCs w:val="16"/>
-                <w14:ligatures w14:val="none"/>
-              </w:rPr>
-              <w:t xml:space="preserve"> Aminah</w:t>
+              <w:t/>
+            </w:r>
+            <w:r>
+              <w:rPr>
+                <w:rFonts w:ascii="Times New Roman" w:eastAsia="Times New Roman" w:hAnsi="Times New Roman" w:cs="Times New Roman"/>
+                <w:kern w:val="0"/>
+                <w:sz w:val="16"/>
+                <w:szCs w:val="16"/>
+                <w14:ligatures w14:val="none"/>
+              </w:rPr>
+              <w:t xml:space="preserve"/>
             </w:r>
           </w:p>
         </w:tc>
@@ -14964,7 +14964,7 @@
                 <w:szCs w:val="16"/>
                 <w14:ligatures w14:val="none"/>
               </w:rPr>
-              <w:t>Abdullah</w:t>
+              <w:t/>
             </w:r>
           </w:p>
         </w:tc>
@@ -15002,7 +15002,7 @@
                 <w:szCs w:val="16"/>
                 <w14:ligatures w14:val="none"/>
               </w:rPr>
-              <w:t>Mohammed O</w:t>
+              <w:t/>
             </w:r>
           </w:p>
         </w:tc>
@@ -15040,7 +15040,7 @@
                 <w:szCs w:val="16"/>
                 <w14:ligatures w14:val="none"/>
               </w:rPr>
-              <w:t>Iman</w:t>
+              <w:t/>
             </w:r>
           </w:p>
         </w:tc>
@@ -15079,7 +15079,7 @@
                 <w:szCs w:val="16"/>
                 <w14:ligatures w14:val="none"/>
               </w:rPr>
-              <w:t>Fatimah</w:t>
+              <w:t/>
             </w:r>
           </w:p>
         </w:tc>
@@ -15118,7 +15118,7 @@
                 <w:szCs w:val="16"/>
                 <w14:ligatures w14:val="none"/>
               </w:rPr>
-              <w:t>Amani</w:t>
+              <w:t/>
             </w:r>
           </w:p>
         </w:tc>
@@ -15183,7 +15183,7 @@
               </w:rPr>
             </w:pPr>
             <w:r>
-              <w:t>23</w:t>
+              <w:t>21</w:t>
             </w:r>
           </w:p>
         </w:tc>
@@ -15212,7 +15212,7 @@
               </w:rPr>
             </w:pPr>
             <w:r>
-              <w:t>08</w:t>
+              <w:t>06</w:t>
             </w:r>
           </w:p>
         </w:tc>
@@ -15231,7 +15231,7 @@
               <w:jc w:val="center"/>
             </w:pPr>
             <w:r>
-              <w:t>Dr. Khadijah</w:t>
+              <w:t>Dr. Zahra Alsanna</w:t>
             </w:r>
           </w:p>
         </w:tc>
@@ -15268,17 +15268,17 @@
                 <w:szCs w:val="16"/>
                 <w14:ligatures w14:val="none"/>
               </w:rPr>
-              <w:t>Dr.</w:t>
-            </w:r>
-            <w:r>
-              <w:rPr>
-                <w:rFonts w:ascii="Times New Roman" w:eastAsia="Times New Roman" w:hAnsi="Times New Roman" w:cs="Times New Roman"/>
-                <w:kern w:val="0"/>
-                <w:sz w:val="16"/>
-                <w:szCs w:val="16"/>
-                <w14:ligatures w14:val="none"/>
-              </w:rPr>
-              <w:t xml:space="preserve"> Aminah</w:t>
+              <w:t/>
+            </w:r>
+            <w:r>
+              <w:rPr>
+                <w:rFonts w:ascii="Times New Roman" w:eastAsia="Times New Roman" w:hAnsi="Times New Roman" w:cs="Times New Roman"/>
+                <w:kern w:val="0"/>
+                <w:sz w:val="16"/>
+                <w:szCs w:val="16"/>
+                <w14:ligatures w14:val="none"/>
+              </w:rPr>
+              <w:t xml:space="preserve"/>
             </w:r>
           </w:p>
         </w:tc>
@@ -15316,7 +15316,7 @@
                 <w:szCs w:val="16"/>
                 <w14:ligatures w14:val="none"/>
               </w:rPr>
-              <w:t>Abdullah</w:t>
+              <w:t/>
             </w:r>
           </w:p>
         </w:tc>
@@ -15354,7 +15354,7 @@
                 <w:szCs w:val="16"/>
                 <w14:ligatures w14:val="none"/>
               </w:rPr>
-              <w:t>Mohammed O</w:t>
+              <w:t/>
             </w:r>
           </w:p>
         </w:tc>
@@ -15392,7 +15392,7 @@
                 <w:szCs w:val="16"/>
                 <w14:ligatures w14:val="none"/>
               </w:rPr>
-              <w:t>Saeed</w:t>
+              <w:t/>
             </w:r>
           </w:p>
         </w:tc>
@@ -15431,7 +15431,7 @@
                 <w:szCs w:val="16"/>
                 <w14:ligatures w14:val="none"/>
               </w:rPr>
-              <w:t>Fatimah</w:t>
+              <w:t/>
             </w:r>
           </w:p>
         </w:tc>
@@ -15470,7 +15470,7 @@
                 <w:szCs w:val="16"/>
                 <w14:ligatures w14:val="none"/>
               </w:rPr>
-              <w:t>AlSultan</w:t>
+              <w:t/>
             </w:r>
           </w:p>
         </w:tc>
@@ -15535,7 +15535,7 @@
               </w:rPr>
             </w:pPr>
             <w:r>
-              <w:t>24</w:t>
+              <w:t>22</w:t>
             </w:r>
           </w:p>
         </w:tc>
@@ -15564,7 +15564,7 @@
               </w:rPr>
             </w:pPr>
             <w:r>
-              <w:t>09</w:t>
+              <w:t>07</w:t>
             </w:r>
           </w:p>
         </w:tc>
@@ -15583,7 +15583,7 @@
               <w:jc w:val="center"/>
             </w:pPr>
             <w:r>
-              <w:t>Dr. Khadijah</w:t>
+              <w:t>Dr. Shamsa</w:t>
             </w:r>
           </w:p>
         </w:tc>
@@ -15620,17 +15620,17 @@
                 <w:szCs w:val="16"/>
                 <w14:ligatures w14:val="none"/>
               </w:rPr>
-              <w:t>Dr.</w:t>
-            </w:r>
-            <w:r>
-              <w:rPr>
-                <w:rFonts w:ascii="Times New Roman" w:eastAsia="Times New Roman" w:hAnsi="Times New Roman" w:cs="Times New Roman"/>
-                <w:kern w:val="0"/>
-                <w:sz w:val="16"/>
-                <w:szCs w:val="16"/>
-                <w14:ligatures w14:val="none"/>
-              </w:rPr>
-              <w:t xml:space="preserve"> Aminah</w:t>
+              <w:t/>
+            </w:r>
+            <w:r>
+              <w:rPr>
+                <w:rFonts w:ascii="Times New Roman" w:eastAsia="Times New Roman" w:hAnsi="Times New Roman" w:cs="Times New Roman"/>
+                <w:kern w:val="0"/>
+                <w:sz w:val="16"/>
+                <w:szCs w:val="16"/>
+                <w14:ligatures w14:val="none"/>
+              </w:rPr>
+              <w:t xml:space="preserve"/>
             </w:r>
           </w:p>
         </w:tc>
@@ -15669,7 +15669,7 @@
                 <w:szCs w:val="16"/>
                 <w14:ligatures w14:val="none"/>
               </w:rPr>
-              <w:t>Abdullah</w:t>
+              <w:t/>
             </w:r>
           </w:p>
         </w:tc>
@@ -15708,7 +15708,7 @@
                 <w:szCs w:val="16"/>
                 <w14:ligatures w14:val="none"/>
               </w:rPr>
-              <w:t>Mohammed O</w:t>
+              <w:t/>
             </w:r>
           </w:p>
         </w:tc>
@@ -15746,7 +15746,7 @@
                 <w:szCs w:val="16"/>
                 <w14:ligatures w14:val="none"/>
               </w:rPr>
-              <w:t>Iman</w:t>
+              <w:t/>
             </w:r>
           </w:p>
         </w:tc>
@@ -15785,7 +15785,7 @@
                 <w:szCs w:val="16"/>
                 <w14:ligatures w14:val="none"/>
               </w:rPr>
-              <w:t>Sadiq</w:t>
+              <w:t/>
             </w:r>
           </w:p>
         </w:tc>
@@ -15824,7 +15824,7 @@
                 <w:szCs w:val="16"/>
                 <w14:ligatures w14:val="none"/>
               </w:rPr>
-              <w:t>Amani</w:t>
+              <w:t/>
             </w:r>
           </w:p>
         </w:tc>
@@ -15889,7 +15889,7 @@
               </w:rPr>
             </w:pPr>
             <w:r>
-              <w:t>25</w:t>
+              <w:t>23</w:t>
             </w:r>
           </w:p>
         </w:tc>
@@ -15918,7 +15918,7 @@
               </w:rPr>
             </w:pPr>
             <w:r>
-              <w:t>10</w:t>
+              <w:t>08</w:t>
             </w:r>
           </w:p>
         </w:tc>
@@ -15937,11 +15937,11 @@
               <w:jc w:val="center"/>
             </w:pPr>
             <w:r>
-              <w:t xml:space="preserve">Dr. Fatimah </w:t>
+              <w:t xml:space="preserve">Dr. Shefa</w:t>
             </w:r>
             <w:proofErr w:type="spellStart"/>
             <w:r>
-              <w:t>Alrubh</w:t>
+              <w:t/>
             </w:r>
             <w:proofErr w:type="spellEnd"/>
           </w:p>
@@ -15979,17 +15979,17 @@
                 <w:szCs w:val="16"/>
                 <w14:ligatures w14:val="none"/>
               </w:rPr>
-              <w:t>Dr.</w:t>
-            </w:r>
-            <w:r>
-              <w:rPr>
-                <w:rFonts w:ascii="Times New Roman" w:eastAsia="Times New Roman" w:hAnsi="Times New Roman" w:cs="Times New Roman"/>
-                <w:kern w:val="0"/>
-                <w:sz w:val="16"/>
-                <w:szCs w:val="16"/>
-                <w14:ligatures w14:val="none"/>
-              </w:rPr>
-              <w:t xml:space="preserve"> Aminah</w:t>
+              <w:t/>
+            </w:r>
+            <w:r>
+              <w:rPr>
+                <w:rFonts w:ascii="Times New Roman" w:eastAsia="Times New Roman" w:hAnsi="Times New Roman" w:cs="Times New Roman"/>
+                <w:kern w:val="0"/>
+                <w:sz w:val="16"/>
+                <w:szCs w:val="16"/>
+                <w14:ligatures w14:val="none"/>
+              </w:rPr>
+              <w:t xml:space="preserve"/>
             </w:r>
           </w:p>
         </w:tc>
@@ -16027,7 +16027,7 @@
                 <w:szCs w:val="16"/>
                 <w14:ligatures w14:val="none"/>
               </w:rPr>
-              <w:t>Abdullah</w:t>
+              <w:t/>
             </w:r>
           </w:p>
         </w:tc>
@@ -16065,7 +16065,7 @@
                 <w:szCs w:val="16"/>
                 <w14:ligatures w14:val="none"/>
               </w:rPr>
-              <w:t>Mohammed O</w:t>
+              <w:t/>
             </w:r>
           </w:p>
         </w:tc>
@@ -16103,7 +16103,7 @@
                 <w:szCs w:val="16"/>
                 <w14:ligatures w14:val="none"/>
               </w:rPr>
-              <w:t>Saeed</w:t>
+              <w:t/>
             </w:r>
           </w:p>
         </w:tc>
@@ -16142,7 +16142,7 @@
                 <w:szCs w:val="16"/>
                 <w14:ligatures w14:val="none"/>
               </w:rPr>
-              <w:t>Fatimah</w:t>
+              <w:t/>
             </w:r>
           </w:p>
         </w:tc>
@@ -16181,7 +16181,7 @@
                 <w:szCs w:val="16"/>
                 <w14:ligatures w14:val="none"/>
               </w:rPr>
-              <w:t>AlSultan</w:t>
+              <w:t/>
             </w:r>
           </w:p>
         </w:tc>
@@ -16248,7 +16248,7 @@
               </w:rPr>
             </w:pPr>
             <w:r>
-              <w:t>26</w:t>
+              <w:t>24</w:t>
             </w:r>
           </w:p>
         </w:tc>
@@ -16278,7 +16278,7 @@
               </w:rPr>
             </w:pPr>
             <w:r>
-              <w:t>11</w:t>
+              <w:t>09</w:t>
             </w:r>
           </w:p>
         </w:tc>
@@ -16298,11 +16298,11 @@
               <w:jc w:val="center"/>
             </w:pPr>
             <w:r>
-              <w:t xml:space="preserve">Dr. Fatimah </w:t>
+              <w:t xml:space="preserve">Dr. Fatimah Alsinan</w:t>
             </w:r>
             <w:proofErr w:type="spellStart"/>
             <w:r>
-              <w:t>Alrubh</w:t>
+              <w:t/>
             </w:r>
             <w:proofErr w:type="spellEnd"/>
           </w:p>
@@ -16341,17 +16341,17 @@
                 <w:szCs w:val="16"/>
                 <w14:ligatures w14:val="none"/>
               </w:rPr>
-              <w:t>Dr.</w:t>
-            </w:r>
-            <w:r>
-              <w:rPr>
-                <w:rFonts w:ascii="Times New Roman" w:eastAsia="Times New Roman" w:hAnsi="Times New Roman" w:cs="Times New Roman"/>
-                <w:kern w:val="0"/>
-                <w:sz w:val="16"/>
-                <w:szCs w:val="16"/>
-                <w14:ligatures w14:val="none"/>
-              </w:rPr>
-              <w:t xml:space="preserve"> Aminah</w:t>
+              <w:t/>
+            </w:r>
+            <w:r>
+              <w:rPr>
+                <w:rFonts w:ascii="Times New Roman" w:eastAsia="Times New Roman" w:hAnsi="Times New Roman" w:cs="Times New Roman"/>
+                <w:kern w:val="0"/>
+                <w:sz w:val="16"/>
+                <w:szCs w:val="16"/>
+                <w14:ligatures w14:val="none"/>
+              </w:rPr>
+              <w:t xml:space="preserve"/>
             </w:r>
           </w:p>
         </w:tc>
@@ -16390,7 +16390,7 @@
                 <w:szCs w:val="16"/>
                 <w14:ligatures w14:val="none"/>
               </w:rPr>
-              <w:t>Abdullah</w:t>
+              <w:t/>
             </w:r>
           </w:p>
         </w:tc>
@@ -16458,7 +16458,7 @@
                 <w:szCs w:val="16"/>
                 <w14:ligatures w14:val="none"/>
               </w:rPr>
-              <w:t>Iman</w:t>
+              <w:t/>
             </w:r>
           </w:p>
           <w:p>
@@ -16544,7 +16544,7 @@
                 <w:szCs w:val="16"/>
                 <w14:ligatures w14:val="none"/>
               </w:rPr>
-              <w:t>Fatimah (3PM-11PM)</w:t>
+              <w:t/>
             </w:r>
           </w:p>
         </w:tc>
@@ -16611,7 +16611,7 @@
               </w:rPr>
             </w:pPr>
             <w:r>
-              <w:t>27</w:t>
+              <w:t>25</w:t>
             </w:r>
           </w:p>
         </w:tc>
@@ -16641,7 +16641,7 @@
               </w:rPr>
             </w:pPr>
             <w:r>
-              <w:t>12</w:t>
+              <w:t>10</w:t>
             </w:r>
           </w:p>
         </w:tc>
@@ -16664,7 +16664,7 @@
               </w:rPr>
             </w:pPr>
             <w:r>
-              <w:t>Dr. Mona</w:t>
+              <w:t>Dr. Khadija</w:t>
             </w:r>
           </w:p>
         </w:tc>
@@ -16702,17 +16702,17 @@
                 <w:szCs w:val="16"/>
                 <w14:ligatures w14:val="none"/>
               </w:rPr>
-              <w:t>Dr.</w:t>
-            </w:r>
-            <w:r>
-              <w:rPr>
-                <w:rFonts w:ascii="Times New Roman" w:eastAsia="Times New Roman" w:hAnsi="Times New Roman" w:cs="Times New Roman"/>
-                <w:kern w:val="0"/>
-                <w:sz w:val="16"/>
-                <w:szCs w:val="16"/>
-                <w14:ligatures w14:val="none"/>
-              </w:rPr>
-              <w:t xml:space="preserve"> Aminah</w:t>
+              <w:t/>
+            </w:r>
+            <w:r>
+              <w:rPr>
+                <w:rFonts w:ascii="Times New Roman" w:eastAsia="Times New Roman" w:hAnsi="Times New Roman" w:cs="Times New Roman"/>
+                <w:kern w:val="0"/>
+                <w:sz w:val="16"/>
+                <w:szCs w:val="16"/>
+                <w14:ligatures w14:val="none"/>
+              </w:rPr>
+              <w:t xml:space="preserve"/>
             </w:r>
           </w:p>
         </w:tc>
@@ -16750,7 +16750,7 @@
                 <w:szCs w:val="16"/>
                 <w14:ligatures w14:val="none"/>
               </w:rPr>
-              <w:t>Abdullah</w:t>
+              <w:t/>
             </w:r>
           </w:p>
         </w:tc>
@@ -16816,7 +16816,7 @@
                 <w:szCs w:val="16"/>
                 <w14:ligatures w14:val="none"/>
               </w:rPr>
-              <w:t>Saeed</w:t>
+              <w:t/>
             </w:r>
           </w:p>
         </w:tc>
@@ -16884,7 +16884,7 @@
                 <w:szCs w:val="16"/>
                 <w14:ligatures w14:val="none"/>
               </w:rPr>
-              <w:t>Abdulrahim</w:t>
+              <w:t/>
             </w:r>
           </w:p>
         </w:tc>
@@ -16949,7 +16949,7 @@
               </w:rPr>
             </w:pPr>
             <w:r>
-              <w:t>28</w:t>
+              <w:t>26</w:t>
             </w:r>
           </w:p>
         </w:tc>
@@ -16978,7 +16978,7 @@
               </w:rPr>
             </w:pPr>
             <w:r>
-              <w:t>13</w:t>
+              <w:t>11</w:t>
             </w:r>
           </w:p>
         </w:tc>
@@ -16997,7 +16997,7 @@
               <w:jc w:val="center"/>
             </w:pPr>
             <w:r>
-              <w:t>Dr. Zainab Alfaraj</w:t>
+              <w:t>Dr. Samar</w:t>
             </w:r>
           </w:p>
         </w:tc>
@@ -17032,17 +17032,17 @@
                 <w:szCs w:val="16"/>
                 <w14:ligatures w14:val="none"/>
               </w:rPr>
-              <w:t>Dr</w:t>
-            </w:r>
-            <w:r>
-              <w:rPr>
-                <w:rFonts w:ascii="Times New Roman" w:eastAsia="Times New Roman" w:hAnsi="Times New Roman" w:cs="Times New Roman"/>
-                <w:kern w:val="0"/>
-                <w:sz w:val="16"/>
-                <w:szCs w:val="16"/>
-                <w14:ligatures w14:val="none"/>
-              </w:rPr>
-              <w:t>. Thuria</w:t>
+              <w:t/>
+            </w:r>
+            <w:r>
+              <w:rPr>
+                <w:rFonts w:ascii="Times New Roman" w:eastAsia="Times New Roman" w:hAnsi="Times New Roman" w:cs="Times New Roman"/>
+                <w:kern w:val="0"/>
+                <w:sz w:val="16"/>
+                <w:szCs w:val="16"/>
+                <w14:ligatures w14:val="none"/>
+              </w:rPr>
+              <w:t/>
             </w:r>
           </w:p>
         </w:tc>
@@ -17080,7 +17080,7 @@
                 <w:szCs w:val="16"/>
                 <w14:ligatures w14:val="none"/>
               </w:rPr>
-              <w:t>Fadel</w:t>
+              <w:t/>
             </w:r>
           </w:p>
         </w:tc>
@@ -17118,7 +17118,7 @@
                 <w:szCs w:val="16"/>
                 <w14:ligatures w14:val="none"/>
               </w:rPr>
-              <w:t>Mohammed S</w:t>
+              <w:t/>
             </w:r>
           </w:p>
         </w:tc>
@@ -17156,7 +17156,7 @@
                 <w:szCs w:val="16"/>
                 <w14:ligatures w14:val="none"/>
               </w:rPr>
-              <w:t>Iman</w:t>
+              <w:t/>
             </w:r>
           </w:p>
         </w:tc>
@@ -17195,7 +17195,7 @@
                 <w:szCs w:val="16"/>
                 <w14:ligatures w14:val="none"/>
               </w:rPr>
-              <w:t>Fatimah</w:t>
+              <w:t/>
             </w:r>
           </w:p>
         </w:tc>
@@ -17234,7 +17234,7 @@
                 <w:szCs w:val="16"/>
                 <w14:ligatures w14:val="none"/>
               </w:rPr>
-              <w:t>Sadiq</w:t>
+              <w:t/>
             </w:r>
           </w:p>
         </w:tc>
@@ -17299,7 +17299,7 @@
               </w:rPr>
             </w:pPr>
             <w:r>
-              <w:t>29</w:t>
+              <w:t>27</w:t>
             </w:r>
           </w:p>
         </w:tc>
@@ -17328,7 +17328,7 @@
               </w:rPr>
             </w:pPr>
             <w:r>
-              <w:t>14</w:t>
+              <w:t>12</w:t>
             </w:r>
           </w:p>
         </w:tc>
@@ -17350,7 +17350,7 @@
               </w:rPr>
             </w:pPr>
             <w:r>
-              <w:t>Dr. Shamsa</w:t>
+              <w:t>Dr. Fatimah Alrbh</w:t>
             </w:r>
           </w:p>
         </w:tc>
@@ -17387,17 +17387,17 @@
                 <w:szCs w:val="16"/>
                 <w14:ligatures w14:val="none"/>
               </w:rPr>
-              <w:t>Dr</w:t>
-            </w:r>
-            <w:r>
-              <w:rPr>
-                <w:rFonts w:ascii="Times New Roman" w:eastAsia="Times New Roman" w:hAnsi="Times New Roman" w:cs="Times New Roman"/>
-                <w:kern w:val="0"/>
-                <w:sz w:val="16"/>
-                <w:szCs w:val="16"/>
-                <w14:ligatures w14:val="none"/>
-              </w:rPr>
-              <w:t>. Thuria</w:t>
+              <w:t/>
+            </w:r>
+            <w:r>
+              <w:rPr>
+                <w:rFonts w:ascii="Times New Roman" w:eastAsia="Times New Roman" w:hAnsi="Times New Roman" w:cs="Times New Roman"/>
+                <w:kern w:val="0"/>
+                <w:sz w:val="16"/>
+                <w:szCs w:val="16"/>
+                <w14:ligatures w14:val="none"/>
+              </w:rPr>
+              <w:t/>
             </w:r>
           </w:p>
         </w:tc>
@@ -17435,7 +17435,7 @@
                 <w:szCs w:val="16"/>
                 <w14:ligatures w14:val="none"/>
               </w:rPr>
-              <w:t>Fadel</w:t>
+              <w:t/>
             </w:r>
           </w:p>
         </w:tc>
@@ -17473,7 +17473,7 @@
                 <w:szCs w:val="16"/>
                 <w14:ligatures w14:val="none"/>
               </w:rPr>
-              <w:t>Mohammed S</w:t>
+              <w:t/>
             </w:r>
           </w:p>
         </w:tc>
@@ -17511,7 +17511,7 @@
                 <w:szCs w:val="16"/>
                 <w14:ligatures w14:val="none"/>
               </w:rPr>
-              <w:t>Abdullah</w:t>
+              <w:t/>
             </w:r>
           </w:p>
         </w:tc>
@@ -17550,7 +17550,7 @@
                 <w:szCs w:val="16"/>
                 <w14:ligatures w14:val="none"/>
               </w:rPr>
-              <w:t>AlSultan</w:t>
+              <w:t/>
             </w:r>
           </w:p>
         </w:tc>
@@ -17589,7 +17589,7 @@
                 <w:szCs w:val="16"/>
                 <w14:ligatures w14:val="none"/>
               </w:rPr>
-              <w:t>Abdulrahim</w:t>
+              <w:t/>
             </w:r>
           </w:p>
         </w:tc>
@@ -17654,7 +17654,7 @@
               </w:rPr>
             </w:pPr>
             <w:r>
-              <w:t>30</w:t>
+              <w:t>28</w:t>
             </w:r>
           </w:p>
         </w:tc>
@@ -17683,7 +17683,7 @@
               </w:rPr>
             </w:pPr>
             <w:r>
-              <w:t>15</w:t>
+              <w:t>13</w:t>
             </w:r>
           </w:p>
         </w:tc>
@@ -17702,7 +17702,7 @@
               <w:jc w:val="center"/>
             </w:pPr>
             <w:r>
-              <w:t>Dr. Ali Alramadhan</w:t>
+              <w:t>Dr. Shamsa</w:t>
             </w:r>
           </w:p>
         </w:tc>
@@ -17739,17 +17739,17 @@
                 <w:szCs w:val="16"/>
                 <w14:ligatures w14:val="none"/>
               </w:rPr>
-              <w:t>Dr</w:t>
-            </w:r>
-            <w:r>
-              <w:rPr>
-                <w:rFonts w:ascii="Times New Roman" w:eastAsia="Times New Roman" w:hAnsi="Times New Roman" w:cs="Times New Roman"/>
-                <w:kern w:val="0"/>
-                <w:sz w:val="16"/>
-                <w:szCs w:val="16"/>
-                <w14:ligatures w14:val="none"/>
-              </w:rPr>
-              <w:t>. Thuria</w:t>
+              <w:t/>
+            </w:r>
+            <w:r>
+              <w:rPr>
+                <w:rFonts w:ascii="Times New Roman" w:eastAsia="Times New Roman" w:hAnsi="Times New Roman" w:cs="Times New Roman"/>
+                <w:kern w:val="0"/>
+                <w:sz w:val="16"/>
+                <w:szCs w:val="16"/>
+                <w14:ligatures w14:val="none"/>
+              </w:rPr>
+              <w:t/>
             </w:r>
           </w:p>
         </w:tc>
@@ -17787,7 +17787,7 @@
                 <w:szCs w:val="16"/>
                 <w14:ligatures w14:val="none"/>
               </w:rPr>
-              <w:t>Fadel</w:t>
+              <w:t/>
             </w:r>
           </w:p>
         </w:tc>
@@ -17825,7 +17825,7 @@
                 <w:szCs w:val="16"/>
                 <w14:ligatures w14:val="none"/>
               </w:rPr>
-              <w:t>Mohammed S</w:t>
+              <w:t/>
             </w:r>
           </w:p>
         </w:tc>
@@ -17863,7 +17863,7 @@
                 <w:szCs w:val="16"/>
                 <w14:ligatures w14:val="none"/>
               </w:rPr>
-              <w:t>Iman</w:t>
+              <w:t/>
             </w:r>
           </w:p>
         </w:tc>
@@ -17902,7 +17902,7 @@
                 <w:szCs w:val="16"/>
                 <w14:ligatures w14:val="none"/>
               </w:rPr>
-              <w:t>Fatimah</w:t>
+              <w:t/>
             </w:r>
           </w:p>
         </w:tc>
@@ -17941,7 +17941,7 @@
                 <w:szCs w:val="16"/>
                 <w14:ligatures w14:val="none"/>
               </w:rPr>
-              <w:t>Sadiq</w:t>
+              <w:t/>
             </w:r>
           </w:p>
         </w:tc>
@@ -18006,7 +18006,7 @@
               </w:rPr>
             </w:pPr>
             <w:r>
-              <w:t>01</w:t>
+              <w:t>29</w:t>
             </w:r>
           </w:p>
         </w:tc>
@@ -18035,7 +18035,7 @@
               </w:rPr>
             </w:pPr>
             <w:r>
-              <w:t>16</w:t>
+              <w:t>14</w:t>
             </w:r>
           </w:p>
         </w:tc>
@@ -18054,11 +18054,11 @@
               <w:jc w:val="center"/>
             </w:pPr>
             <w:r>
-              <w:t xml:space="preserve">Dr. Fatimah </w:t>
+              <w:t xml:space="preserve">Dr. Mona</w:t>
             </w:r>
             <w:proofErr w:type="spellStart"/>
             <w:r>
-              <w:t>Alrubh</w:t>
+              <w:t/>
             </w:r>
             <w:proofErr w:type="spellEnd"/>
           </w:p>
@@ -18096,17 +18096,17 @@
                 <w:szCs w:val="16"/>
                 <w14:ligatures w14:val="none"/>
               </w:rPr>
-              <w:t>Dr</w:t>
-            </w:r>
-            <w:r>
-              <w:rPr>
-                <w:rFonts w:ascii="Times New Roman" w:eastAsia="Times New Roman" w:hAnsi="Times New Roman" w:cs="Times New Roman"/>
-                <w:kern w:val="0"/>
-                <w:sz w:val="16"/>
-                <w:szCs w:val="16"/>
-                <w14:ligatures w14:val="none"/>
-              </w:rPr>
-              <w:t>. Thuria</w:t>
+              <w:t/>
+            </w:r>
+            <w:r>
+              <w:rPr>
+                <w:rFonts w:ascii="Times New Roman" w:eastAsia="Times New Roman" w:hAnsi="Times New Roman" w:cs="Times New Roman"/>
+                <w:kern w:val="0"/>
+                <w:sz w:val="16"/>
+                <w:szCs w:val="16"/>
+                <w14:ligatures w14:val="none"/>
+              </w:rPr>
+              <w:t/>
             </w:r>
           </w:p>
         </w:tc>
@@ -18144,7 +18144,7 @@
                 <w:szCs w:val="16"/>
                 <w14:ligatures w14:val="none"/>
               </w:rPr>
-              <w:t>Fadel</w:t>
+              <w:t/>
             </w:r>
           </w:p>
         </w:tc>
@@ -18182,7 +18182,7 @@
                 <w:szCs w:val="16"/>
                 <w14:ligatures w14:val="none"/>
               </w:rPr>
-              <w:t>Mohammed S</w:t>
+              <w:t/>
             </w:r>
           </w:p>
         </w:tc>
@@ -18220,7 +18220,7 @@
                 <w:szCs w:val="16"/>
                 <w14:ligatures w14:val="none"/>
               </w:rPr>
-              <w:t>Saeed</w:t>
+              <w:t/>
             </w:r>
           </w:p>
         </w:tc>
@@ -18259,7 +18259,7 @@
                 <w:szCs w:val="16"/>
                 <w14:ligatures w14:val="none"/>
               </w:rPr>
-              <w:t>AlSultan</w:t>
+              <w:t/>
             </w:r>
           </w:p>
         </w:tc>
@@ -18298,7 +18298,7 @@
                 <w:szCs w:val="16"/>
                 <w14:ligatures w14:val="none"/>
               </w:rPr>
-              <w:t>Abdulrahim</w:t>
+              <w:t/>
             </w:r>
           </w:p>
         </w:tc>
@@ -18363,7 +18363,7 @@
               </w:rPr>
             </w:pPr>
             <w:r>
-              <w:t>02</w:t>
+              <w:t>30</w:t>
             </w:r>
           </w:p>
         </w:tc>
@@ -18392,7 +18392,7 @@
               </w:rPr>
             </w:pPr>
             <w:r>
-              <w:t>17</w:t>
+              <w:t>15</w:t>
             </w:r>
           </w:p>
         </w:tc>
@@ -18411,11 +18411,11 @@
               <w:jc w:val="center"/>
             </w:pPr>
             <w:r>
-              <w:t xml:space="preserve">Dr. Fatimah </w:t>
+              <w:t xml:space="preserve">Dr. Zahra Alsanna</w:t>
             </w:r>
             <w:proofErr w:type="spellStart"/>
             <w:r>
-              <w:t>Alrubh</w:t>
+              <w:t/>
             </w:r>
             <w:proofErr w:type="spellEnd"/>
           </w:p>
@@ -18453,17 +18453,17 @@
                 <w:szCs w:val="16"/>
                 <w14:ligatures w14:val="none"/>
               </w:rPr>
-              <w:t>Dr</w:t>
-            </w:r>
-            <w:r>
-              <w:rPr>
-                <w:rFonts w:ascii="Times New Roman" w:eastAsia="Times New Roman" w:hAnsi="Times New Roman" w:cs="Times New Roman"/>
-                <w:kern w:val="0"/>
-                <w:sz w:val="16"/>
-                <w:szCs w:val="16"/>
-                <w14:ligatures w14:val="none"/>
-              </w:rPr>
-              <w:t>. Thuria</w:t>
+              <w:t/>
+            </w:r>
+            <w:r>
+              <w:rPr>
+                <w:rFonts w:ascii="Times New Roman" w:eastAsia="Times New Roman" w:hAnsi="Times New Roman" w:cs="Times New Roman"/>
+                <w:kern w:val="0"/>
+                <w:sz w:val="16"/>
+                <w:szCs w:val="16"/>
+                <w14:ligatures w14:val="none"/>
+              </w:rPr>
+              <w:t/>
             </w:r>
           </w:p>
         </w:tc>
@@ -18501,7 +18501,7 @@
                 <w:szCs w:val="16"/>
                 <w14:ligatures w14:val="none"/>
               </w:rPr>
-              <w:t>Fadel</w:t>
+              <w:t/>
             </w:r>
           </w:p>
         </w:tc>
@@ -18539,7 +18539,7 @@
                 <w:szCs w:val="16"/>
                 <w14:ligatures w14:val="none"/>
               </w:rPr>
-              <w:t>Mohammed S</w:t>
+              <w:t/>
             </w:r>
           </w:p>
         </w:tc>
@@ -18577,7 +18577,7 @@
                 <w:szCs w:val="16"/>
                 <w14:ligatures w14:val="none"/>
               </w:rPr>
-              <w:t>Iman</w:t>
+              <w:t/>
             </w:r>
           </w:p>
         </w:tc>
@@ -18616,7 +18616,7 @@
                 <w:szCs w:val="16"/>
                 <w14:ligatures w14:val="none"/>
               </w:rPr>
-              <w:t>Fatimah</w:t>
+              <w:t/>
             </w:r>
           </w:p>
         </w:tc>
@@ -18655,7 +18655,7 @@
                 <w:szCs w:val="16"/>
                 <w14:ligatures w14:val="none"/>
               </w:rPr>
-              <w:t>Sadiq (3PM-11PM)</w:t>
+              <w:t/>
             </w:r>
           </w:p>
         </w:tc>
@@ -18723,7 +18723,7 @@
               </w:rPr>
             </w:pPr>
             <w:r>
-              <w:t>03</w:t>
+              <w:t>31</w:t>
             </w:r>
           </w:p>
         </w:tc>
@@ -18753,7 +18753,7 @@
               </w:rPr>
             </w:pPr>
             <w:r>
-              <w:t>18</w:t>
+              <w:t>16</w:t>
             </w:r>
           </w:p>
         </w:tc>
@@ -18773,7 +18773,7 @@
               <w:jc w:val="center"/>
             </w:pPr>
             <w:r>
-              <w:t>Dr. Shefa</w:t>
+              <w:t>Dr. Fatimah Alrebh</w:t>
             </w:r>
           </w:p>
         </w:tc>
@@ -18811,17 +18811,17 @@
                 <w:szCs w:val="16"/>
                 <w14:ligatures w14:val="none"/>
               </w:rPr>
-              <w:t>Dr</w:t>
-            </w:r>
-            <w:r>
-              <w:rPr>
-                <w:rFonts w:ascii="Times New Roman" w:eastAsia="Times New Roman" w:hAnsi="Times New Roman" w:cs="Times New Roman"/>
-                <w:kern w:val="0"/>
-                <w:sz w:val="16"/>
-                <w:szCs w:val="16"/>
-                <w14:ligatures w14:val="none"/>
-              </w:rPr>
-              <w:t>. Thuria</w:t>
+              <w:t/>
+            </w:r>
+            <w:r>
+              <w:rPr>
+                <w:rFonts w:ascii="Times New Roman" w:eastAsia="Times New Roman" w:hAnsi="Times New Roman" w:cs="Times New Roman"/>
+                <w:kern w:val="0"/>
+                <w:sz w:val="16"/>
+                <w:szCs w:val="16"/>
+                <w14:ligatures w14:val="none"/>
+              </w:rPr>
+              <w:t/>
             </w:r>
           </w:p>
         </w:tc>
@@ -18860,7 +18860,7 @@
                 <w:szCs w:val="16"/>
                 <w14:ligatures w14:val="none"/>
               </w:rPr>
-              <w:t>Fadel</w:t>
+              <w:t/>
             </w:r>
           </w:p>
         </w:tc>
@@ -18928,7 +18928,7 @@
                 <w:szCs w:val="16"/>
                 <w14:ligatures w14:val="none"/>
               </w:rPr>
-              <w:t>Abdullah</w:t>
+              <w:t/>
             </w:r>
           </w:p>
         </w:tc>
@@ -18998,7 +18998,7 @@
                 <w:szCs w:val="16"/>
                 <w14:ligatures w14:val="none"/>
               </w:rPr>
-              <w:t>AlSultan</w:t>
+              <w:t/>
             </w:r>
           </w:p>
         </w:tc>
@@ -19066,7 +19066,7 @@
               </w:rPr>
             </w:pPr>
             <w:r>
-              <w:t>04</w:t>
+              <w:t>01</w:t>
             </w:r>
           </w:p>
         </w:tc>
@@ -19096,7 +19096,7 @@
               </w:rPr>
             </w:pPr>
             <w:r>
-              <w:t>19</w:t>
+              <w:t>17</w:t>
             </w:r>
           </w:p>
         </w:tc>
@@ -19116,7 +19116,7 @@
               <w:jc w:val="center"/>
             </w:pPr>
             <w:r>
-              <w:t>Dr. Shefa</w:t>
+              <w:t>Dr. Ali Alramadhan</w:t>
             </w:r>
           </w:p>
         </w:tc>
@@ -19154,17 +19154,17 @@
                 <w:szCs w:val="16"/>
                 <w14:ligatures w14:val="none"/>
               </w:rPr>
-              <w:t>Dr</w:t>
-            </w:r>
-            <w:r>
-              <w:rPr>
-                <w:rFonts w:ascii="Times New Roman" w:eastAsia="Times New Roman" w:hAnsi="Times New Roman" w:cs="Times New Roman"/>
-                <w:kern w:val="0"/>
-                <w:sz w:val="16"/>
-                <w:szCs w:val="16"/>
-                <w14:ligatures w14:val="none"/>
-              </w:rPr>
-              <w:t>. Thuria</w:t>
+              <w:t/>
+            </w:r>
+            <w:r>
+              <w:rPr>
+                <w:rFonts w:ascii="Times New Roman" w:eastAsia="Times New Roman" w:hAnsi="Times New Roman" w:cs="Times New Roman"/>
+                <w:kern w:val="0"/>
+                <w:sz w:val="16"/>
+                <w:szCs w:val="16"/>
+                <w14:ligatures w14:val="none"/>
+              </w:rPr>
+              <w:t/>
             </w:r>
           </w:p>
         </w:tc>
@@ -19203,7 +19203,7 @@
                 <w:szCs w:val="16"/>
                 <w14:ligatures w14:val="none"/>
               </w:rPr>
-              <w:t>Fadel</w:t>
+              <w:t/>
             </w:r>
           </w:p>
         </w:tc>
@@ -19271,7 +19271,7 @@
                 <w:szCs w:val="16"/>
                 <w14:ligatures w14:val="none"/>
               </w:rPr>
-              <w:t>Iman</w:t>
+              <w:t/>
             </w:r>
           </w:p>
         </w:tc>
@@ -19341,7 +19341,7 @@
                 <w:szCs w:val="16"/>
                 <w14:ligatures w14:val="none"/>
               </w:rPr>
-              <w:t xml:space="preserve">Fatimah </w:t>
+              <w:t xml:space="preserve"/>
             </w:r>
             <w:proofErr w:type="gramStart"/>
             <w:r>
@@ -19352,7 +19352,7 @@
                 <w:szCs w:val="16"/>
                 <w14:ligatures w14:val="none"/>
               </w:rPr>
-              <w:t>( 3</w:t>
+              <w:t/>
             </w:r>
             <w:proofErr w:type="gramEnd"/>
             <w:r>
@@ -19363,7 +19363,7 @@
                 <w:szCs w:val="16"/>
                 <w14:ligatures w14:val="none"/>
               </w:rPr>
-              <w:t>PM-11PM)</w:t>
+              <w:t/>
             </w:r>
           </w:p>
         </w:tc>

</xml_diff>

<commit_message>
Fix Hawraa Albaiek's rotation listing: remove stale Development/external rotator entry, add her to GI subspecialty coverage
Co-Authored-By: Claude <noreply@anthropic.com>
</commit_message>
<xml_diff>
--- a/app/block11_template.docx
+++ b/app/block11_template.docx
@@ -21359,20 +21359,6 @@
                 <w:szCs w:val="20"/>
                 <w:rtl w:val="0"/>
               </w:rPr>
-              <w:t xml:space="preserve">Hawraa Albaik (Develop)</w:t>
-            </w:r>
-          </w:p>
-          <w:p>
-            <w:pPr>
-              <w:jc w:val="left"/>
-              <w:bidi w:val="0"/>
-            </w:pPr>
-            <w:r>
-              <w:rPr>
-                <w:sz w:val="20"/>
-                <w:szCs w:val="20"/>
-                <w:rtl w:val="0"/>
-              </w:rPr>
               <w:t xml:space="preserve">Ali Almarzooq (Neuro)</w:t>
             </w:r>
           </w:p>
@@ -21806,7 +21792,7 @@
                 <w:szCs w:val="20"/>
                 <w:rtl w:val="0"/>
               </w:rPr>
-              <w:t xml:space="preserve">GI:  –</w:t>
+              <w:t xml:space="preserve">GI:  Hawraa Albaiek</w:t>
             </w:r>
           </w:p>
         </w:tc>

</xml_diff>

<commit_message>
Fill NICU/PICU specialist and consultant on-call columns in Block 11 template
Split merged first-week cells to add per-day Morning/OnCall NICU specialist
coverage and PICU Consultant1/Consultant2/Night Call assignments, and filled
the NICU on-call column with weekly attending rotation, sourced from
NICUspecialist.pdf, the PICU coverage image, and 07 NICU Rota July 2026.docx.

Co-Authored-By: Claude <noreply@anthropic.com>
</commit_message>
<xml_diff>
--- a/app/block11_template.docx
+++ b/app/block11_template.docx
@@ -10550,14 +10550,13 @@
                 <w:sz w:val="18"/>
                 <w:szCs w:val="18"/>
               </w:rPr>
-              <w:t/>
-            </w:r>
-          </w:p>
-        </w:tc>
-        <w:tc>
-          <w:tcPr>
-            <w:tcW w:w="4111" w:type="dxa"/>
-            <w:gridSpan w:val="3"/>
+              <w:t>Dr. Mohammed</w:t>
+            </w:r>
+          </w:p>
+        </w:tc>
+        <w:tc>
+          <w:tcPr>
+            <w:tcW w:w="1370" w:type="dxa"/>
             <w:tcBorders>
               <w:top w:val="single" w:sz="4" w:space="0" w:color="auto"/>
               <w:left w:val="single" w:sz="4" w:space="0" w:color="auto"/>
@@ -10587,21 +10586,19 @@
                 <w:sz w:val="16"/>
                 <w:szCs w:val="16"/>
               </w:rPr>
-              <w:t/>
-            </w:r>
-          </w:p>
-        </w:tc>
-        <w:tc>
-          <w:tcPr>
-            <w:tcW w:w="4108" w:type="dxa"/>
-            <w:gridSpan w:val="2"/>
-            <w:tcBorders>
-              <w:top w:val="single" w:sz="4" w:space="0" w:color="auto"/>
-              <w:left w:val="single" w:sz="4" w:space="0" w:color="auto"/>
-              <w:bottom w:val="single" w:sz="4" w:space="0" w:color="auto"/>
-              <w:right w:val="single" w:sz="4" w:space="0" w:color="auto"/>
-            </w:tcBorders>
-            <w:vAlign w:val="center"/>
+              <w:t>Dr. Saeed</w:t>
+            </w:r>
+          </w:p>
+        </w:tc>
+        <w:tc>
+          <w:tcPr>
+            <w:tcW w:w="1370" w:type="dxa"/>
+            <w:tcBorders>
+              <w:top w:val="single" w:sz="4" w:space="0" w:color="auto"/>
+              <w:left w:val="single" w:sz="4" w:space="0" w:color="auto"/>
+              <w:bottom w:val="single" w:sz="4" w:space="0" w:color="auto"/>
+              <w:right w:val="single" w:sz="4" w:space="0" w:color="auto"/>
+            </w:tcBorders>
           </w:tcPr>
           <w:p>
             <w:pPr>
@@ -10621,13 +10618,125 @@
             </w:pPr>
             <w:r>
               <w:rPr>
-                <w:rFonts w:asciiTheme="majorBidi" w:eastAsia="Times New Roman" w:hAnsiTheme="majorBidi" w:cstheme="majorBidi"/>
-                <w:kern w:val="0"/>
-                <w:sz w:val="16"/>
-                <w:szCs w:val="16"/>
-                <w14:ligatures w14:val="none"/>
-              </w:rPr>
-              <w:t/>
+                <w:rFonts w:asciiTheme="majorBidi" w:hAnsiTheme="majorBidi" w:cstheme="majorBidi"/>
+                <w:sz w:val="16"/>
+                <w:szCs w:val="16"/>
+              </w:rPr>
+              <w:t>Dr. Mohammed.O</w:t>
+            </w:r>
+          </w:p>
+        </w:tc>
+        <w:tc>
+          <w:tcPr>
+            <w:tcW w:w="1371" w:type="dxa"/>
+            <w:tcBorders>
+              <w:top w:val="single" w:sz="4" w:space="0" w:color="auto"/>
+              <w:left w:val="single" w:sz="4" w:space="0" w:color="auto"/>
+              <w:bottom w:val="single" w:sz="4" w:space="0" w:color="auto"/>
+              <w:right w:val="single" w:sz="4" w:space="0" w:color="auto"/>
+            </w:tcBorders>
+          </w:tcPr>
+          <w:p>
+            <w:pPr>
+              <w:widowControl w:val="0"/>
+              <w:autoSpaceDE w:val="0"/>
+              <w:autoSpaceDN w:val="0"/>
+              <w:bidi w:val="0"/>
+              <w:spacing w:line="142" w:lineRule="exact"/>
+              <w:jc w:val="center"/>
+              <w:rPr>
+                <w:rFonts w:asciiTheme="majorBidi" w:eastAsia="Times New Roman" w:hAnsiTheme="majorBidi" w:cstheme="majorBidi"/>
+                <w:kern w:val="0"/>
+                <w:sz w:val="16"/>
+                <w:szCs w:val="16"/>
+                <w14:ligatures w14:val="none"/>
+              </w:rPr>
+            </w:pPr>
+            <w:r>
+              <w:rPr>
+                <w:rFonts w:asciiTheme="majorBidi" w:hAnsiTheme="majorBidi" w:cstheme="majorBidi"/>
+                <w:sz w:val="16"/>
+                <w:szCs w:val="16"/>
+              </w:rPr>
+              <w:t>Dr. Abdullah</w:t>
+            </w:r>
+          </w:p>
+        </w:tc>
+        <w:tc>
+          <w:tcPr>
+            <w:tcW w:w="2054" w:type="dxa"/>
+            <w:tcBorders>
+              <w:top w:val="single" w:sz="4" w:space="0" w:color="auto"/>
+              <w:left w:val="single" w:sz="4" w:space="0" w:color="auto"/>
+              <w:bottom w:val="single" w:sz="4" w:space="0" w:color="auto"/>
+              <w:right w:val="single" w:sz="4" w:space="0" w:color="auto"/>
+            </w:tcBorders>
+            <w:vAlign w:val="center"/>
+          </w:tcPr>
+          <w:p>
+            <w:pPr>
+              <w:widowControl w:val="0"/>
+              <w:autoSpaceDE w:val="0"/>
+              <w:autoSpaceDN w:val="0"/>
+              <w:bidi w:val="0"/>
+              <w:spacing w:line="142" w:lineRule="exact"/>
+              <w:jc w:val="center"/>
+              <w:rPr>
+                <w:rFonts w:asciiTheme="majorBidi" w:eastAsia="Times New Roman" w:hAnsiTheme="majorBidi" w:cstheme="majorBidi"/>
+                <w:kern w:val="0"/>
+                <w:sz w:val="16"/>
+                <w:szCs w:val="16"/>
+                <w14:ligatures w14:val="none"/>
+              </w:rPr>
+            </w:pPr>
+            <w:r>
+              <w:rPr>
+                <w:rFonts w:asciiTheme="majorBidi" w:eastAsia="Times New Roman" w:hAnsiTheme="majorBidi" w:cstheme="majorBidi"/>
+                <w:kern w:val="0"/>
+                <w:sz w:val="16"/>
+                <w:szCs w:val="16"/>
+                <w14:ligatures w14:val="none"/>
+              </w:rPr>
+              <w:t>Dr. Sadiq</w:t>
+            </w:r>
+          </w:p>
+        </w:tc>
+        <w:tc>
+          <w:tcPr>
+            <w:tcW w:w="2054" w:type="dxa"/>
+            <w:tcBorders>
+              <w:top w:val="single" w:sz="4" w:space="0" w:color="auto"/>
+              <w:left w:val="single" w:sz="4" w:space="0" w:color="auto"/>
+              <w:bottom w:val="single" w:sz="4" w:space="0" w:color="auto"/>
+              <w:right w:val="single" w:sz="4" w:space="0" w:color="auto"/>
+            </w:tcBorders>
+            <w:vAlign w:val="center"/>
+          </w:tcPr>
+          <w:p>
+            <w:pPr>
+              <w:widowControl w:val="0"/>
+              <w:autoSpaceDE w:val="0"/>
+              <w:autoSpaceDN w:val="0"/>
+              <w:bidi w:val="0"/>
+              <w:spacing w:line="142" w:lineRule="exact"/>
+              <w:jc w:val="center"/>
+              <w:rPr>
+                <w:rFonts w:asciiTheme="majorBidi" w:eastAsia="Times New Roman" w:hAnsiTheme="majorBidi" w:cstheme="majorBidi"/>
+                <w:kern w:val="0"/>
+                <w:sz w:val="16"/>
+                <w:szCs w:val="16"/>
+                <w14:ligatures w14:val="none"/>
+              </w:rPr>
+            </w:pPr>
+            <w:r>
+              <w:rPr>
+                <w:rFonts w:asciiTheme="majorBidi" w:eastAsia="Times New Roman" w:hAnsiTheme="majorBidi" w:cstheme="majorBidi"/>
+                <w:kern w:val="0"/>
+                <w:sz w:val="16"/>
+                <w:szCs w:val="16"/>
+                <w14:ligatures w14:val="none"/>
+              </w:rPr>
+              <w:t>Dr. Alsultan (3pm-11pm)</w:t>
             </w:r>
           </w:p>
         </w:tc>
@@ -10771,14 +10880,13 @@
                 <w:sz w:val="18"/>
                 <w:szCs w:val="18"/>
               </w:rPr>
-              <w:t/>
-            </w:r>
-          </w:p>
-        </w:tc>
-        <w:tc>
-          <w:tcPr>
-            <w:tcW w:w="4111" w:type="dxa"/>
-            <w:gridSpan w:val="3"/>
+              <w:t>Dr. Mohammed</w:t>
+            </w:r>
+          </w:p>
+        </w:tc>
+        <w:tc>
+          <w:tcPr>
+            <w:tcW w:w="1370" w:type="dxa"/>
             <w:tcBorders>
               <w:top w:val="single" w:sz="4" w:space="0" w:color="auto"/>
               <w:left w:val="single" w:sz="4" w:space="0" w:color="auto"/>
@@ -10808,21 +10916,19 @@
                 <w:sz w:val="16"/>
                 <w:szCs w:val="16"/>
               </w:rPr>
-              <w:t/>
-            </w:r>
-          </w:p>
-        </w:tc>
-        <w:tc>
-          <w:tcPr>
-            <w:tcW w:w="4108" w:type="dxa"/>
-            <w:gridSpan w:val="2"/>
-            <w:tcBorders>
-              <w:top w:val="single" w:sz="4" w:space="0" w:color="auto"/>
-              <w:left w:val="single" w:sz="4" w:space="0" w:color="auto"/>
-              <w:bottom w:val="single" w:sz="4" w:space="0" w:color="auto"/>
-              <w:right w:val="single" w:sz="4" w:space="0" w:color="auto"/>
-            </w:tcBorders>
-            <w:vAlign w:val="center"/>
+              <w:t>Dr. Saeed</w:t>
+            </w:r>
+          </w:p>
+        </w:tc>
+        <w:tc>
+          <w:tcPr>
+            <w:tcW w:w="1370" w:type="dxa"/>
+            <w:tcBorders>
+              <w:top w:val="single" w:sz="4" w:space="0" w:color="auto"/>
+              <w:left w:val="single" w:sz="4" w:space="0" w:color="auto"/>
+              <w:bottom w:val="single" w:sz="4" w:space="0" w:color="auto"/>
+              <w:right w:val="single" w:sz="4" w:space="0" w:color="auto"/>
+            </w:tcBorders>
           </w:tcPr>
           <w:p>
             <w:pPr>
@@ -10842,13 +10948,125 @@
             </w:pPr>
             <w:r>
               <w:rPr>
-                <w:rFonts w:asciiTheme="majorBidi" w:eastAsia="Times New Roman" w:hAnsiTheme="majorBidi" w:cstheme="majorBidi"/>
-                <w:kern w:val="0"/>
-                <w:sz w:val="16"/>
-                <w:szCs w:val="16"/>
-                <w14:ligatures w14:val="none"/>
-              </w:rPr>
-              <w:t/>
+                <w:rFonts w:asciiTheme="majorBidi" w:hAnsiTheme="majorBidi" w:cstheme="majorBidi"/>
+                <w:sz w:val="16"/>
+                <w:szCs w:val="16"/>
+              </w:rPr>
+              <w:t>Dr. Mohammed.O</w:t>
+            </w:r>
+          </w:p>
+        </w:tc>
+        <w:tc>
+          <w:tcPr>
+            <w:tcW w:w="1371" w:type="dxa"/>
+            <w:tcBorders>
+              <w:top w:val="single" w:sz="4" w:space="0" w:color="auto"/>
+              <w:left w:val="single" w:sz="4" w:space="0" w:color="auto"/>
+              <w:bottom w:val="single" w:sz="4" w:space="0" w:color="auto"/>
+              <w:right w:val="single" w:sz="4" w:space="0" w:color="auto"/>
+            </w:tcBorders>
+          </w:tcPr>
+          <w:p>
+            <w:pPr>
+              <w:widowControl w:val="0"/>
+              <w:autoSpaceDE w:val="0"/>
+              <w:autoSpaceDN w:val="0"/>
+              <w:bidi w:val="0"/>
+              <w:spacing w:line="142" w:lineRule="exact"/>
+              <w:jc w:val="center"/>
+              <w:rPr>
+                <w:rFonts w:asciiTheme="majorBidi" w:eastAsia="Times New Roman" w:hAnsiTheme="majorBidi" w:cstheme="majorBidi"/>
+                <w:kern w:val="0"/>
+                <w:sz w:val="16"/>
+                <w:szCs w:val="16"/>
+                <w14:ligatures w14:val="none"/>
+              </w:rPr>
+            </w:pPr>
+            <w:r>
+              <w:rPr>
+                <w:rFonts w:asciiTheme="majorBidi" w:hAnsiTheme="majorBidi" w:cstheme="majorBidi"/>
+                <w:sz w:val="16"/>
+                <w:szCs w:val="16"/>
+              </w:rPr>
+              <w:t>Dr. Fadel</w:t>
+            </w:r>
+          </w:p>
+        </w:tc>
+        <w:tc>
+          <w:tcPr>
+            <w:tcW w:w="2054" w:type="dxa"/>
+            <w:tcBorders>
+              <w:top w:val="single" w:sz="4" w:space="0" w:color="auto"/>
+              <w:left w:val="single" w:sz="4" w:space="0" w:color="auto"/>
+              <w:bottom w:val="single" w:sz="4" w:space="0" w:color="auto"/>
+              <w:right w:val="single" w:sz="4" w:space="0" w:color="auto"/>
+            </w:tcBorders>
+            <w:vAlign w:val="center"/>
+          </w:tcPr>
+          <w:p>
+            <w:pPr>
+              <w:widowControl w:val="0"/>
+              <w:autoSpaceDE w:val="0"/>
+              <w:autoSpaceDN w:val="0"/>
+              <w:bidi w:val="0"/>
+              <w:spacing w:line="142" w:lineRule="exact"/>
+              <w:jc w:val="center"/>
+              <w:rPr>
+                <w:rFonts w:asciiTheme="majorBidi" w:eastAsia="Times New Roman" w:hAnsiTheme="majorBidi" w:cstheme="majorBidi"/>
+                <w:kern w:val="0"/>
+                <w:sz w:val="16"/>
+                <w:szCs w:val="16"/>
+                <w14:ligatures w14:val="none"/>
+              </w:rPr>
+            </w:pPr>
+            <w:r>
+              <w:rPr>
+                <w:rFonts w:asciiTheme="majorBidi" w:eastAsia="Times New Roman" w:hAnsiTheme="majorBidi" w:cstheme="majorBidi"/>
+                <w:kern w:val="0"/>
+                <w:sz w:val="16"/>
+                <w:szCs w:val="16"/>
+                <w14:ligatures w14:val="none"/>
+              </w:rPr>
+              <w:t>Dr. Sadiq</w:t>
+            </w:r>
+          </w:p>
+        </w:tc>
+        <w:tc>
+          <w:tcPr>
+            <w:tcW w:w="2054" w:type="dxa"/>
+            <w:tcBorders>
+              <w:top w:val="single" w:sz="4" w:space="0" w:color="auto"/>
+              <w:left w:val="single" w:sz="4" w:space="0" w:color="auto"/>
+              <w:bottom w:val="single" w:sz="4" w:space="0" w:color="auto"/>
+              <w:right w:val="single" w:sz="4" w:space="0" w:color="auto"/>
+            </w:tcBorders>
+            <w:vAlign w:val="center"/>
+          </w:tcPr>
+          <w:p>
+            <w:pPr>
+              <w:widowControl w:val="0"/>
+              <w:autoSpaceDE w:val="0"/>
+              <w:autoSpaceDN w:val="0"/>
+              <w:bidi w:val="0"/>
+              <w:spacing w:line="142" w:lineRule="exact"/>
+              <w:jc w:val="center"/>
+              <w:rPr>
+                <w:rFonts w:asciiTheme="majorBidi" w:eastAsia="Times New Roman" w:hAnsiTheme="majorBidi" w:cstheme="majorBidi"/>
+                <w:kern w:val="0"/>
+                <w:sz w:val="16"/>
+                <w:szCs w:val="16"/>
+                <w14:ligatures w14:val="none"/>
+              </w:rPr>
+            </w:pPr>
+            <w:r>
+              <w:rPr>
+                <w:rFonts w:asciiTheme="majorBidi" w:eastAsia="Times New Roman" w:hAnsiTheme="majorBidi" w:cstheme="majorBidi"/>
+                <w:kern w:val="0"/>
+                <w:sz w:val="16"/>
+                <w:szCs w:val="16"/>
+                <w14:ligatures w14:val="none"/>
+              </w:rPr>
+              <w:t>Dr. Abdulrahim</w:t>
             </w:r>
           </w:p>
         </w:tc>
@@ -10992,14 +11210,13 @@
                 <w:sz w:val="18"/>
                 <w:szCs w:val="18"/>
               </w:rPr>
-              <w:t xml:space="preserve"/>
-            </w:r>
-          </w:p>
-        </w:tc>
-        <w:tc>
-          <w:tcPr>
-            <w:tcW w:w="4111" w:type="dxa"/>
-            <w:gridSpan w:val="3"/>
+              <w:t xml:space="preserve">Dr. Mohammed</w:t>
+            </w:r>
+          </w:p>
+        </w:tc>
+        <w:tc>
+          <w:tcPr>
+            <w:tcW w:w="1370" w:type="dxa"/>
             <w:tcBorders>
               <w:top w:val="single" w:sz="4" w:space="0" w:color="auto"/>
               <w:left w:val="single" w:sz="4" w:space="0" w:color="auto"/>
@@ -11029,21 +11246,19 @@
                 <w:sz w:val="16"/>
                 <w:szCs w:val="16"/>
               </w:rPr>
-              <w:t/>
-            </w:r>
-          </w:p>
-        </w:tc>
-        <w:tc>
-          <w:tcPr>
-            <w:tcW w:w="4108" w:type="dxa"/>
-            <w:gridSpan w:val="2"/>
-            <w:tcBorders>
-              <w:top w:val="single" w:sz="4" w:space="0" w:color="auto"/>
-              <w:left w:val="single" w:sz="4" w:space="0" w:color="auto"/>
-              <w:bottom w:val="single" w:sz="4" w:space="0" w:color="auto"/>
-              <w:right w:val="single" w:sz="4" w:space="0" w:color="auto"/>
-            </w:tcBorders>
-            <w:vAlign w:val="center"/>
+              <w:t>Dr. Saeed</w:t>
+            </w:r>
+          </w:p>
+        </w:tc>
+        <w:tc>
+          <w:tcPr>
+            <w:tcW w:w="1370" w:type="dxa"/>
+            <w:tcBorders>
+              <w:top w:val="single" w:sz="4" w:space="0" w:color="auto"/>
+              <w:left w:val="single" w:sz="4" w:space="0" w:color="auto"/>
+              <w:bottom w:val="single" w:sz="4" w:space="0" w:color="auto"/>
+              <w:right w:val="single" w:sz="4" w:space="0" w:color="auto"/>
+            </w:tcBorders>
           </w:tcPr>
           <w:p>
             <w:pPr>
@@ -11063,13 +11278,125 @@
             </w:pPr>
             <w:r>
               <w:rPr>
-                <w:rFonts w:asciiTheme="majorBidi" w:eastAsia="Times New Roman" w:hAnsiTheme="majorBidi" w:cstheme="majorBidi"/>
-                <w:kern w:val="0"/>
-                <w:sz w:val="16"/>
-                <w:szCs w:val="16"/>
-                <w14:ligatures w14:val="none"/>
-              </w:rPr>
-              <w:t/>
+                <w:rFonts w:asciiTheme="majorBidi" w:hAnsiTheme="majorBidi" w:cstheme="majorBidi"/>
+                <w:sz w:val="16"/>
+                <w:szCs w:val="16"/>
+              </w:rPr>
+              <w:t>Dr. Mohammed.O</w:t>
+            </w:r>
+          </w:p>
+        </w:tc>
+        <w:tc>
+          <w:tcPr>
+            <w:tcW w:w="1371" w:type="dxa"/>
+            <w:tcBorders>
+              <w:top w:val="single" w:sz="4" w:space="0" w:color="auto"/>
+              <w:left w:val="single" w:sz="4" w:space="0" w:color="auto"/>
+              <w:bottom w:val="single" w:sz="4" w:space="0" w:color="auto"/>
+              <w:right w:val="single" w:sz="4" w:space="0" w:color="auto"/>
+            </w:tcBorders>
+          </w:tcPr>
+          <w:p>
+            <w:pPr>
+              <w:widowControl w:val="0"/>
+              <w:autoSpaceDE w:val="0"/>
+              <w:autoSpaceDN w:val="0"/>
+              <w:bidi w:val="0"/>
+              <w:spacing w:line="142" w:lineRule="exact"/>
+              <w:jc w:val="center"/>
+              <w:rPr>
+                <w:rFonts w:asciiTheme="majorBidi" w:eastAsia="Times New Roman" w:hAnsiTheme="majorBidi" w:cstheme="majorBidi"/>
+                <w:kern w:val="0"/>
+                <w:sz w:val="16"/>
+                <w:szCs w:val="16"/>
+                <w14:ligatures w14:val="none"/>
+              </w:rPr>
+            </w:pPr>
+            <w:r>
+              <w:rPr>
+                <w:rFonts w:asciiTheme="majorBidi" w:hAnsiTheme="majorBidi" w:cstheme="majorBidi"/>
+                <w:sz w:val="16"/>
+                <w:szCs w:val="16"/>
+              </w:rPr>
+              <w:t>Dr. Abdullah</w:t>
+            </w:r>
+          </w:p>
+        </w:tc>
+        <w:tc>
+          <w:tcPr>
+            <w:tcW w:w="2054" w:type="dxa"/>
+            <w:tcBorders>
+              <w:top w:val="single" w:sz="4" w:space="0" w:color="auto"/>
+              <w:left w:val="single" w:sz="4" w:space="0" w:color="auto"/>
+              <w:bottom w:val="single" w:sz="4" w:space="0" w:color="auto"/>
+              <w:right w:val="single" w:sz="4" w:space="0" w:color="auto"/>
+            </w:tcBorders>
+            <w:vAlign w:val="center"/>
+          </w:tcPr>
+          <w:p>
+            <w:pPr>
+              <w:widowControl w:val="0"/>
+              <w:autoSpaceDE w:val="0"/>
+              <w:autoSpaceDN w:val="0"/>
+              <w:bidi w:val="0"/>
+              <w:spacing w:line="142" w:lineRule="exact"/>
+              <w:jc w:val="center"/>
+              <w:rPr>
+                <w:rFonts w:asciiTheme="majorBidi" w:eastAsia="Times New Roman" w:hAnsiTheme="majorBidi" w:cstheme="majorBidi"/>
+                <w:kern w:val="0"/>
+                <w:sz w:val="16"/>
+                <w:szCs w:val="16"/>
+                <w14:ligatures w14:val="none"/>
+              </w:rPr>
+            </w:pPr>
+            <w:r>
+              <w:rPr>
+                <w:rFonts w:asciiTheme="majorBidi" w:eastAsia="Times New Roman" w:hAnsiTheme="majorBidi" w:cstheme="majorBidi"/>
+                <w:kern w:val="0"/>
+                <w:sz w:val="16"/>
+                <w:szCs w:val="16"/>
+                <w14:ligatures w14:val="none"/>
+              </w:rPr>
+              <w:t>Dr. Sadiq</w:t>
+            </w:r>
+          </w:p>
+        </w:tc>
+        <w:tc>
+          <w:tcPr>
+            <w:tcW w:w="2054" w:type="dxa"/>
+            <w:tcBorders>
+              <w:top w:val="single" w:sz="4" w:space="0" w:color="auto"/>
+              <w:left w:val="single" w:sz="4" w:space="0" w:color="auto"/>
+              <w:bottom w:val="single" w:sz="4" w:space="0" w:color="auto"/>
+              <w:right w:val="single" w:sz="4" w:space="0" w:color="auto"/>
+            </w:tcBorders>
+            <w:vAlign w:val="center"/>
+          </w:tcPr>
+          <w:p>
+            <w:pPr>
+              <w:widowControl w:val="0"/>
+              <w:autoSpaceDE w:val="0"/>
+              <w:autoSpaceDN w:val="0"/>
+              <w:bidi w:val="0"/>
+              <w:spacing w:line="142" w:lineRule="exact"/>
+              <w:jc w:val="center"/>
+              <w:rPr>
+                <w:rFonts w:asciiTheme="majorBidi" w:eastAsia="Times New Roman" w:hAnsiTheme="majorBidi" w:cstheme="majorBidi"/>
+                <w:kern w:val="0"/>
+                <w:sz w:val="16"/>
+                <w:szCs w:val="16"/>
+                <w14:ligatures w14:val="none"/>
+              </w:rPr>
+            </w:pPr>
+            <w:r>
+              <w:rPr>
+                <w:rFonts w:asciiTheme="majorBidi" w:eastAsia="Times New Roman" w:hAnsiTheme="majorBidi" w:cstheme="majorBidi"/>
+                <w:kern w:val="0"/>
+                <w:sz w:val="16"/>
+                <w:szCs w:val="16"/>
+                <w14:ligatures w14:val="none"/>
+              </w:rPr>
+              <w:t>Dr. Alsultan (3pm-11pm)</w:t>
             </w:r>
           </w:p>
         </w:tc>
@@ -11218,14 +11545,13 @@
                 <w:sz w:val="18"/>
                 <w:szCs w:val="18"/>
               </w:rPr>
-              <w:t/>
-            </w:r>
-          </w:p>
-        </w:tc>
-        <w:tc>
-          <w:tcPr>
-            <w:tcW w:w="4111" w:type="dxa"/>
-            <w:gridSpan w:val="3"/>
+              <w:t>Dr. Mohammed</w:t>
+            </w:r>
+          </w:p>
+        </w:tc>
+        <w:tc>
+          <w:tcPr>
+            <w:tcW w:w="1370" w:type="dxa"/>
             <w:tcBorders>
               <w:top w:val="single" w:sz="4" w:space="0" w:color="auto"/>
               <w:left w:val="single" w:sz="4" w:space="0" w:color="auto"/>
@@ -11255,21 +11581,19 @@
                 <w:sz w:val="16"/>
                 <w:szCs w:val="16"/>
               </w:rPr>
-              <w:t/>
-            </w:r>
-          </w:p>
-        </w:tc>
-        <w:tc>
-          <w:tcPr>
-            <w:tcW w:w="4108" w:type="dxa"/>
-            <w:gridSpan w:val="2"/>
-            <w:tcBorders>
-              <w:top w:val="single" w:sz="4" w:space="0" w:color="auto"/>
-              <w:left w:val="single" w:sz="4" w:space="0" w:color="auto"/>
-              <w:bottom w:val="single" w:sz="4" w:space="0" w:color="auto"/>
-              <w:right w:val="single" w:sz="4" w:space="0" w:color="auto"/>
-            </w:tcBorders>
-            <w:vAlign w:val="center"/>
+              <w:t>Dr. Saeed</w:t>
+            </w:r>
+          </w:p>
+        </w:tc>
+        <w:tc>
+          <w:tcPr>
+            <w:tcW w:w="1370" w:type="dxa"/>
+            <w:tcBorders>
+              <w:top w:val="single" w:sz="4" w:space="0" w:color="auto"/>
+              <w:left w:val="single" w:sz="4" w:space="0" w:color="auto"/>
+              <w:bottom w:val="single" w:sz="4" w:space="0" w:color="auto"/>
+              <w:right w:val="single" w:sz="4" w:space="0" w:color="auto"/>
+            </w:tcBorders>
           </w:tcPr>
           <w:p>
             <w:pPr>
@@ -11289,13 +11613,125 @@
             </w:pPr>
             <w:r>
               <w:rPr>
-                <w:rFonts w:asciiTheme="majorBidi" w:eastAsia="Times New Roman" w:hAnsiTheme="majorBidi" w:cstheme="majorBidi"/>
-                <w:kern w:val="0"/>
-                <w:sz w:val="16"/>
-                <w:szCs w:val="16"/>
-                <w14:ligatures w14:val="none"/>
-              </w:rPr>
-              <w:t/>
+                <w:rFonts w:asciiTheme="majorBidi" w:hAnsiTheme="majorBidi" w:cstheme="majorBidi"/>
+                <w:sz w:val="16"/>
+                <w:szCs w:val="16"/>
+              </w:rPr>
+              <w:t>Dr. Mohammed.O</w:t>
+            </w:r>
+          </w:p>
+        </w:tc>
+        <w:tc>
+          <w:tcPr>
+            <w:tcW w:w="1371" w:type="dxa"/>
+            <w:tcBorders>
+              <w:top w:val="single" w:sz="4" w:space="0" w:color="auto"/>
+              <w:left w:val="single" w:sz="4" w:space="0" w:color="auto"/>
+              <w:bottom w:val="single" w:sz="4" w:space="0" w:color="auto"/>
+              <w:right w:val="single" w:sz="4" w:space="0" w:color="auto"/>
+            </w:tcBorders>
+          </w:tcPr>
+          <w:p>
+            <w:pPr>
+              <w:widowControl w:val="0"/>
+              <w:autoSpaceDE w:val="0"/>
+              <w:autoSpaceDN w:val="0"/>
+              <w:bidi w:val="0"/>
+              <w:spacing w:line="142" w:lineRule="exact"/>
+              <w:jc w:val="center"/>
+              <w:rPr>
+                <w:rFonts w:asciiTheme="majorBidi" w:eastAsia="Times New Roman" w:hAnsiTheme="majorBidi" w:cstheme="majorBidi"/>
+                <w:kern w:val="0"/>
+                <w:sz w:val="16"/>
+                <w:szCs w:val="16"/>
+                <w14:ligatures w14:val="none"/>
+              </w:rPr>
+            </w:pPr>
+            <w:r>
+              <w:rPr>
+                <w:rFonts w:asciiTheme="majorBidi" w:hAnsiTheme="majorBidi" w:cstheme="majorBidi"/>
+                <w:sz w:val="16"/>
+                <w:szCs w:val="16"/>
+              </w:rPr>
+              <w:t>Dr. Fadel</w:t>
+            </w:r>
+          </w:p>
+        </w:tc>
+        <w:tc>
+          <w:tcPr>
+            <w:tcW w:w="2054" w:type="dxa"/>
+            <w:tcBorders>
+              <w:top w:val="single" w:sz="4" w:space="0" w:color="auto"/>
+              <w:left w:val="single" w:sz="4" w:space="0" w:color="auto"/>
+              <w:bottom w:val="single" w:sz="4" w:space="0" w:color="auto"/>
+              <w:right w:val="single" w:sz="4" w:space="0" w:color="auto"/>
+            </w:tcBorders>
+            <w:vAlign w:val="center"/>
+          </w:tcPr>
+          <w:p>
+            <w:pPr>
+              <w:widowControl w:val="0"/>
+              <w:autoSpaceDE w:val="0"/>
+              <w:autoSpaceDN w:val="0"/>
+              <w:bidi w:val="0"/>
+              <w:spacing w:line="142" w:lineRule="exact"/>
+              <w:jc w:val="center"/>
+              <w:rPr>
+                <w:rFonts w:asciiTheme="majorBidi" w:eastAsia="Times New Roman" w:hAnsiTheme="majorBidi" w:cstheme="majorBidi"/>
+                <w:kern w:val="0"/>
+                <w:sz w:val="16"/>
+                <w:szCs w:val="16"/>
+                <w14:ligatures w14:val="none"/>
+              </w:rPr>
+            </w:pPr>
+            <w:r>
+              <w:rPr>
+                <w:rFonts w:asciiTheme="majorBidi" w:eastAsia="Times New Roman" w:hAnsiTheme="majorBidi" w:cstheme="majorBidi"/>
+                <w:kern w:val="0"/>
+                <w:sz w:val="16"/>
+                <w:szCs w:val="16"/>
+                <w14:ligatures w14:val="none"/>
+              </w:rPr>
+              <w:t>Dr. Fatimah</w:t>
+            </w:r>
+          </w:p>
+        </w:tc>
+        <w:tc>
+          <w:tcPr>
+            <w:tcW w:w="2054" w:type="dxa"/>
+            <w:tcBorders>
+              <w:top w:val="single" w:sz="4" w:space="0" w:color="auto"/>
+              <w:left w:val="single" w:sz="4" w:space="0" w:color="auto"/>
+              <w:bottom w:val="single" w:sz="4" w:space="0" w:color="auto"/>
+              <w:right w:val="single" w:sz="4" w:space="0" w:color="auto"/>
+            </w:tcBorders>
+            <w:vAlign w:val="center"/>
+          </w:tcPr>
+          <w:p>
+            <w:pPr>
+              <w:widowControl w:val="0"/>
+              <w:autoSpaceDE w:val="0"/>
+              <w:autoSpaceDN w:val="0"/>
+              <w:bidi w:val="0"/>
+              <w:spacing w:line="142" w:lineRule="exact"/>
+              <w:jc w:val="center"/>
+              <w:rPr>
+                <w:rFonts w:asciiTheme="majorBidi" w:eastAsia="Times New Roman" w:hAnsiTheme="majorBidi" w:cstheme="majorBidi"/>
+                <w:kern w:val="0"/>
+                <w:sz w:val="16"/>
+                <w:szCs w:val="16"/>
+                <w14:ligatures w14:val="none"/>
+              </w:rPr>
+            </w:pPr>
+            <w:r>
+              <w:rPr>
+                <w:rFonts w:asciiTheme="majorBidi" w:eastAsia="Times New Roman" w:hAnsiTheme="majorBidi" w:cstheme="majorBidi"/>
+                <w:kern w:val="0"/>
+                <w:sz w:val="16"/>
+                <w:szCs w:val="16"/>
+                <w14:ligatures w14:val="none"/>
+              </w:rPr>
+              <w:t>Dr. Sadiq</w:t>
             </w:r>
           </w:p>
         </w:tc>
@@ -11444,14 +11880,13 @@
                 <w:sz w:val="18"/>
                 <w:szCs w:val="18"/>
               </w:rPr>
-              <w:t/>
-            </w:r>
-          </w:p>
-        </w:tc>
-        <w:tc>
-          <w:tcPr>
-            <w:tcW w:w="4111" w:type="dxa"/>
-            <w:gridSpan w:val="3"/>
+              <w:t>Dr. Mohammed</w:t>
+            </w:r>
+          </w:p>
+        </w:tc>
+        <w:tc>
+          <w:tcPr>
+            <w:tcW w:w="1370" w:type="dxa"/>
             <w:tcBorders>
               <w:top w:val="single" w:sz="4" w:space="0" w:color="auto"/>
               <w:left w:val="single" w:sz="4" w:space="0" w:color="auto"/>
@@ -11481,21 +11916,19 @@
                 <w:sz w:val="16"/>
                 <w:szCs w:val="16"/>
               </w:rPr>
-              <w:t/>
-            </w:r>
-          </w:p>
-        </w:tc>
-        <w:tc>
-          <w:tcPr>
-            <w:tcW w:w="4108" w:type="dxa"/>
-            <w:gridSpan w:val="2"/>
-            <w:tcBorders>
-              <w:top w:val="single" w:sz="4" w:space="0" w:color="auto"/>
-              <w:left w:val="single" w:sz="4" w:space="0" w:color="auto"/>
-              <w:bottom w:val="single" w:sz="4" w:space="0" w:color="auto"/>
-              <w:right w:val="single" w:sz="4" w:space="0" w:color="auto"/>
-            </w:tcBorders>
-            <w:vAlign w:val="center"/>
+              <w:t>Dr. Saeed</w:t>
+            </w:r>
+          </w:p>
+        </w:tc>
+        <w:tc>
+          <w:tcPr>
+            <w:tcW w:w="1370" w:type="dxa"/>
+            <w:tcBorders>
+              <w:top w:val="single" w:sz="4" w:space="0" w:color="auto"/>
+              <w:left w:val="single" w:sz="4" w:space="0" w:color="auto"/>
+              <w:bottom w:val="single" w:sz="4" w:space="0" w:color="auto"/>
+              <w:right w:val="single" w:sz="4" w:space="0" w:color="auto"/>
+            </w:tcBorders>
           </w:tcPr>
           <w:p>
             <w:pPr>
@@ -11515,13 +11948,125 @@
             </w:pPr>
             <w:r>
               <w:rPr>
-                <w:rFonts w:asciiTheme="majorBidi" w:eastAsia="Times New Roman" w:hAnsiTheme="majorBidi" w:cstheme="majorBidi"/>
-                <w:kern w:val="0"/>
-                <w:sz w:val="16"/>
-                <w:szCs w:val="16"/>
-                <w14:ligatures w14:val="none"/>
-              </w:rPr>
-              <w:t/>
+                <w:rFonts w:asciiTheme="majorBidi" w:hAnsiTheme="majorBidi" w:cstheme="majorBidi"/>
+                <w:sz w:val="16"/>
+                <w:szCs w:val="16"/>
+              </w:rPr>
+              <w:t>Dr. Mohammed.O</w:t>
+            </w:r>
+          </w:p>
+        </w:tc>
+        <w:tc>
+          <w:tcPr>
+            <w:tcW w:w="1371" w:type="dxa"/>
+            <w:tcBorders>
+              <w:top w:val="single" w:sz="4" w:space="0" w:color="auto"/>
+              <w:left w:val="single" w:sz="4" w:space="0" w:color="auto"/>
+              <w:bottom w:val="single" w:sz="4" w:space="0" w:color="auto"/>
+              <w:right w:val="single" w:sz="4" w:space="0" w:color="auto"/>
+            </w:tcBorders>
+          </w:tcPr>
+          <w:p>
+            <w:pPr>
+              <w:widowControl w:val="0"/>
+              <w:autoSpaceDE w:val="0"/>
+              <w:autoSpaceDN w:val="0"/>
+              <w:bidi w:val="0"/>
+              <w:spacing w:line="142" w:lineRule="exact"/>
+              <w:jc w:val="center"/>
+              <w:rPr>
+                <w:rFonts w:asciiTheme="majorBidi" w:eastAsia="Times New Roman" w:hAnsiTheme="majorBidi" w:cstheme="majorBidi"/>
+                <w:kern w:val="0"/>
+                <w:sz w:val="16"/>
+                <w:szCs w:val="16"/>
+                <w14:ligatures w14:val="none"/>
+              </w:rPr>
+            </w:pPr>
+            <w:r>
+              <w:rPr>
+                <w:rFonts w:asciiTheme="majorBidi" w:hAnsiTheme="majorBidi" w:cstheme="majorBidi"/>
+                <w:sz w:val="16"/>
+                <w:szCs w:val="16"/>
+              </w:rPr>
+              <w:t>Dr. Abdullah</w:t>
+            </w:r>
+          </w:p>
+        </w:tc>
+        <w:tc>
+          <w:tcPr>
+            <w:tcW w:w="2054" w:type="dxa"/>
+            <w:tcBorders>
+              <w:top w:val="single" w:sz="4" w:space="0" w:color="auto"/>
+              <w:left w:val="single" w:sz="4" w:space="0" w:color="auto"/>
+              <w:bottom w:val="single" w:sz="4" w:space="0" w:color="auto"/>
+              <w:right w:val="single" w:sz="4" w:space="0" w:color="auto"/>
+            </w:tcBorders>
+            <w:vAlign w:val="center"/>
+          </w:tcPr>
+          <w:p>
+            <w:pPr>
+              <w:widowControl w:val="0"/>
+              <w:autoSpaceDE w:val="0"/>
+              <w:autoSpaceDN w:val="0"/>
+              <w:bidi w:val="0"/>
+              <w:spacing w:line="142" w:lineRule="exact"/>
+              <w:jc w:val="center"/>
+              <w:rPr>
+                <w:rFonts w:asciiTheme="majorBidi" w:eastAsia="Times New Roman" w:hAnsiTheme="majorBidi" w:cstheme="majorBidi"/>
+                <w:kern w:val="0"/>
+                <w:sz w:val="16"/>
+                <w:szCs w:val="16"/>
+                <w14:ligatures w14:val="none"/>
+              </w:rPr>
+            </w:pPr>
+            <w:r>
+              <w:rPr>
+                <w:rFonts w:asciiTheme="majorBidi" w:eastAsia="Times New Roman" w:hAnsiTheme="majorBidi" w:cstheme="majorBidi"/>
+                <w:kern w:val="0"/>
+                <w:sz w:val="16"/>
+                <w:szCs w:val="16"/>
+                <w14:ligatures w14:val="none"/>
+              </w:rPr>
+              <w:t>Dr. Fatimah</w:t>
+            </w:r>
+          </w:p>
+        </w:tc>
+        <w:tc>
+          <w:tcPr>
+            <w:tcW w:w="2054" w:type="dxa"/>
+            <w:tcBorders>
+              <w:top w:val="single" w:sz="4" w:space="0" w:color="auto"/>
+              <w:left w:val="single" w:sz="4" w:space="0" w:color="auto"/>
+              <w:bottom w:val="single" w:sz="4" w:space="0" w:color="auto"/>
+              <w:right w:val="single" w:sz="4" w:space="0" w:color="auto"/>
+            </w:tcBorders>
+            <w:vAlign w:val="center"/>
+          </w:tcPr>
+          <w:p>
+            <w:pPr>
+              <w:widowControl w:val="0"/>
+              <w:autoSpaceDE w:val="0"/>
+              <w:autoSpaceDN w:val="0"/>
+              <w:bidi w:val="0"/>
+              <w:spacing w:line="142" w:lineRule="exact"/>
+              <w:jc w:val="center"/>
+              <w:rPr>
+                <w:rFonts w:asciiTheme="majorBidi" w:eastAsia="Times New Roman" w:hAnsiTheme="majorBidi" w:cstheme="majorBidi"/>
+                <w:kern w:val="0"/>
+                <w:sz w:val="16"/>
+                <w:szCs w:val="16"/>
+                <w14:ligatures w14:val="none"/>
+              </w:rPr>
+            </w:pPr>
+            <w:r>
+              <w:rPr>
+                <w:rFonts w:asciiTheme="majorBidi" w:eastAsia="Times New Roman" w:hAnsiTheme="majorBidi" w:cstheme="majorBidi"/>
+                <w:kern w:val="0"/>
+                <w:sz w:val="16"/>
+                <w:szCs w:val="16"/>
+                <w14:ligatures w14:val="none"/>
+              </w:rPr>
+              <w:t>Dr. Alsultan (3pm-11pm)</w:t>
             </w:r>
           </w:p>
         </w:tc>
@@ -11676,14 +12221,87 @@
                 <w:sz w:val="18"/>
                 <w:szCs w:val="18"/>
               </w:rPr>
+              <w:t>Dr. Mohammed</w:t>
+            </w:r>
+          </w:p>
+        </w:tc>
+        <w:tc>
+          <w:tcPr>
+            <w:tcW w:w="1370" w:type="dxa"/>
+            <w:tcBorders>
+              <w:top w:val="single" w:sz="4" w:space="0" w:color="auto"/>
+              <w:left w:val="single" w:sz="4" w:space="0" w:color="auto"/>
+              <w:bottom w:val="single" w:sz="4" w:space="0" w:color="auto"/>
+              <w:right w:val="single" w:sz="4" w:space="0" w:color="auto"/>
+            </w:tcBorders>
+            <w:shd w:val="clear" w:color="auto" w:fill="A6A6A6"/>
+          </w:tcPr>
+          <w:p>
+            <w:pPr>
+              <w:widowControl w:val="0"/>
+              <w:autoSpaceDE w:val="0"/>
+              <w:autoSpaceDN w:val="0"/>
+              <w:bidi w:val="0"/>
+              <w:spacing w:line="142" w:lineRule="exact"/>
+              <w:jc w:val="center"/>
+              <w:rPr>
+                <w:rFonts w:asciiTheme="majorBidi" w:eastAsia="Times New Roman" w:hAnsiTheme="majorBidi" w:cstheme="majorBidi"/>
+                <w:kern w:val="0"/>
+                <w:sz w:val="16"/>
+                <w:szCs w:val="16"/>
+                <w14:ligatures w14:val="none"/>
+              </w:rPr>
+            </w:pPr>
+            <w:r>
+              <w:rPr>
+                <w:rFonts w:asciiTheme="majorBidi" w:hAnsiTheme="majorBidi" w:cstheme="majorBidi"/>
+                <w:sz w:val="16"/>
+                <w:szCs w:val="16"/>
+              </w:rPr>
+              <w:t>Dr. Saeed</w:t>
+            </w:r>
+          </w:p>
+        </w:tc>
+        <w:tc>
+          <w:tcPr>
+            <w:tcW w:w="1370" w:type="dxa"/>
+            <w:tcBorders>
+              <w:top w:val="single" w:sz="4" w:space="0" w:color="auto"/>
+              <w:left w:val="single" w:sz="4" w:space="0" w:color="auto"/>
+              <w:bottom w:val="single" w:sz="4" w:space="0" w:color="auto"/>
+              <w:right w:val="single" w:sz="4" w:space="0" w:color="auto"/>
+            </w:tcBorders>
+            <w:shd w:val="clear" w:color="auto" w:fill="A6A6A6"/>
+          </w:tcPr>
+          <w:p>
+            <w:pPr>
+              <w:widowControl w:val="0"/>
+              <w:autoSpaceDE w:val="0"/>
+              <w:autoSpaceDN w:val="0"/>
+              <w:bidi w:val="0"/>
+              <w:spacing w:line="142" w:lineRule="exact"/>
+              <w:jc w:val="center"/>
+              <w:rPr>
+                <w:rFonts w:asciiTheme="majorBidi" w:eastAsia="Times New Roman" w:hAnsiTheme="majorBidi" w:cstheme="majorBidi"/>
+                <w:kern w:val="0"/>
+                <w:sz w:val="16"/>
+                <w:szCs w:val="16"/>
+                <w14:ligatures w14:val="none"/>
+              </w:rPr>
+            </w:pPr>
+            <w:r>
+              <w:rPr>
+                <w:rFonts w:asciiTheme="majorBidi" w:hAnsiTheme="majorBidi" w:cstheme="majorBidi"/>
+                <w:sz w:val="16"/>
+                <w:szCs w:val="16"/>
+              </w:rPr>
               <w:t/>
             </w:r>
           </w:p>
         </w:tc>
         <w:tc>
           <w:tcPr>
-            <w:tcW w:w="4111" w:type="dxa"/>
-            <w:gridSpan w:val="3"/>
+            <w:tcW w:w="1371" w:type="dxa"/>
             <w:tcBorders>
               <w:top w:val="single" w:sz="4" w:space="0" w:color="auto"/>
               <w:left w:val="single" w:sz="4" w:space="0" w:color="auto"/>
@@ -11714,14 +12332,13 @@
                 <w:sz w:val="16"/>
                 <w:szCs w:val="16"/>
               </w:rPr>
-              <w:t/>
-            </w:r>
-          </w:p>
-        </w:tc>
-        <w:tc>
-          <w:tcPr>
-            <w:tcW w:w="4108" w:type="dxa"/>
-            <w:gridSpan w:val="2"/>
+              <w:t>Dr. Fadel</w:t>
+            </w:r>
+          </w:p>
+        </w:tc>
+        <w:tc>
+          <w:tcPr>
+            <w:tcW w:w="2054" w:type="dxa"/>
             <w:tcBorders>
               <w:top w:val="single" w:sz="4" w:space="0" w:color="auto"/>
               <w:left w:val="single" w:sz="4" w:space="0" w:color="auto"/>
@@ -11747,6 +12364,42 @@
                 <w14:ligatures w14:val="none"/>
               </w:rPr>
             </w:pPr>
+            <w:r>
+              <w:t>-</w:t>
+            </w:r>
+          </w:p>
+        </w:tc>
+        <w:tc>
+          <w:tcPr>
+            <w:tcW w:w="2054" w:type="dxa"/>
+            <w:tcBorders>
+              <w:top w:val="single" w:sz="4" w:space="0" w:color="auto"/>
+              <w:left w:val="single" w:sz="4" w:space="0" w:color="auto"/>
+              <w:bottom w:val="single" w:sz="4" w:space="0" w:color="auto"/>
+              <w:right w:val="single" w:sz="4" w:space="0" w:color="auto"/>
+            </w:tcBorders>
+            <w:shd w:val="clear" w:color="auto" w:fill="A6A6A6"/>
+            <w:vAlign w:val="center"/>
+          </w:tcPr>
+          <w:p>
+            <w:pPr>
+              <w:widowControl w:val="0"/>
+              <w:autoSpaceDE w:val="0"/>
+              <w:autoSpaceDN w:val="0"/>
+              <w:bidi w:val="0"/>
+              <w:spacing w:line="142" w:lineRule="exact"/>
+              <w:jc w:val="center"/>
+              <w:rPr>
+                <w:rFonts w:asciiTheme="majorBidi" w:eastAsia="Times New Roman" w:hAnsiTheme="majorBidi" w:cstheme="majorBidi"/>
+                <w:kern w:val="0"/>
+                <w:sz w:val="16"/>
+                <w:szCs w:val="16"/>
+                <w14:ligatures w14:val="none"/>
+              </w:rPr>
+            </w:pPr>
+            <w:r>
+              <w:t>Dr. Alsultan</w:t>
+            </w:r>
           </w:p>
         </w:tc>
       </w:tr>
@@ -11895,14 +12548,87 @@
                 <w:sz w:val="18"/>
                 <w:szCs w:val="18"/>
               </w:rPr>
+              <w:t>Dr. Mohammed</w:t>
+            </w:r>
+          </w:p>
+        </w:tc>
+        <w:tc>
+          <w:tcPr>
+            <w:tcW w:w="1370" w:type="dxa"/>
+            <w:tcBorders>
+              <w:top w:val="single" w:sz="4" w:space="0" w:color="auto"/>
+              <w:left w:val="single" w:sz="4" w:space="0" w:color="auto"/>
+              <w:bottom w:val="single" w:sz="4" w:space="0" w:color="auto"/>
+              <w:right w:val="single" w:sz="4" w:space="0" w:color="auto"/>
+            </w:tcBorders>
+            <w:shd w:val="clear" w:color="auto" w:fill="A6A6A6"/>
+          </w:tcPr>
+          <w:p>
+            <w:pPr>
+              <w:widowControl w:val="0"/>
+              <w:autoSpaceDE w:val="0"/>
+              <w:autoSpaceDN w:val="0"/>
+              <w:bidi w:val="0"/>
+              <w:spacing w:line="142" w:lineRule="exact"/>
+              <w:jc w:val="center"/>
+              <w:rPr>
+                <w:rFonts w:asciiTheme="majorBidi" w:eastAsia="Times New Roman" w:hAnsiTheme="majorBidi" w:cstheme="majorBidi"/>
+                <w:kern w:val="0"/>
+                <w:sz w:val="16"/>
+                <w:szCs w:val="16"/>
+                <w14:ligatures w14:val="none"/>
+              </w:rPr>
+            </w:pPr>
+            <w:r>
+              <w:rPr>
+                <w:rFonts w:asciiTheme="majorBidi" w:hAnsiTheme="majorBidi" w:cstheme="majorBidi"/>
+                <w:sz w:val="16"/>
+                <w:szCs w:val="16"/>
+              </w:rPr>
+              <w:t>Dr. Saeed</w:t>
+            </w:r>
+          </w:p>
+        </w:tc>
+        <w:tc>
+          <w:tcPr>
+            <w:tcW w:w="1370" w:type="dxa"/>
+            <w:tcBorders>
+              <w:top w:val="single" w:sz="4" w:space="0" w:color="auto"/>
+              <w:left w:val="single" w:sz="4" w:space="0" w:color="auto"/>
+              <w:bottom w:val="single" w:sz="4" w:space="0" w:color="auto"/>
+              <w:right w:val="single" w:sz="4" w:space="0" w:color="auto"/>
+            </w:tcBorders>
+            <w:shd w:val="clear" w:color="auto" w:fill="A6A6A6"/>
+          </w:tcPr>
+          <w:p>
+            <w:pPr>
+              <w:widowControl w:val="0"/>
+              <w:autoSpaceDE w:val="0"/>
+              <w:autoSpaceDN w:val="0"/>
+              <w:bidi w:val="0"/>
+              <w:spacing w:line="142" w:lineRule="exact"/>
+              <w:jc w:val="center"/>
+              <w:rPr>
+                <w:rFonts w:asciiTheme="majorBidi" w:eastAsia="Times New Roman" w:hAnsiTheme="majorBidi" w:cstheme="majorBidi"/>
+                <w:kern w:val="0"/>
+                <w:sz w:val="16"/>
+                <w:szCs w:val="16"/>
+                <w14:ligatures w14:val="none"/>
+              </w:rPr>
+            </w:pPr>
+            <w:r>
+              <w:rPr>
+                <w:rFonts w:asciiTheme="majorBidi" w:hAnsiTheme="majorBidi" w:cstheme="majorBidi"/>
+                <w:sz w:val="16"/>
+                <w:szCs w:val="16"/>
+              </w:rPr>
               <w:t/>
             </w:r>
           </w:p>
         </w:tc>
         <w:tc>
           <w:tcPr>
-            <w:tcW w:w="4111" w:type="dxa"/>
-            <w:gridSpan w:val="3"/>
+            <w:tcW w:w="1371" w:type="dxa"/>
             <w:tcBorders>
               <w:top w:val="single" w:sz="4" w:space="0" w:color="auto"/>
               <w:left w:val="single" w:sz="4" w:space="0" w:color="auto"/>
@@ -11933,14 +12659,13 @@
                 <w:sz w:val="16"/>
                 <w:szCs w:val="16"/>
               </w:rPr>
-              <w:t/>
-            </w:r>
-          </w:p>
-        </w:tc>
-        <w:tc>
-          <w:tcPr>
-            <w:tcW w:w="4108" w:type="dxa"/>
-            <w:gridSpan w:val="2"/>
+              <w:t>Dr. Abdullah</w:t>
+            </w:r>
+          </w:p>
+        </w:tc>
+        <w:tc>
+          <w:tcPr>
+            <w:tcW w:w="2054" w:type="dxa"/>
             <w:tcBorders>
               <w:top w:val="single" w:sz="4" w:space="0" w:color="auto"/>
               <w:left w:val="single" w:sz="4" w:space="0" w:color="auto"/>
@@ -11973,7 +12698,46 @@
                 <w:szCs w:val="16"/>
                 <w14:ligatures w14:val="none"/>
               </w:rPr>
-              <w:t/>
+              <w:t>-</w:t>
+            </w:r>
+          </w:p>
+        </w:tc>
+        <w:tc>
+          <w:tcPr>
+            <w:tcW w:w="2054" w:type="dxa"/>
+            <w:tcBorders>
+              <w:top w:val="single" w:sz="4" w:space="0" w:color="auto"/>
+              <w:left w:val="single" w:sz="4" w:space="0" w:color="auto"/>
+              <w:bottom w:val="single" w:sz="4" w:space="0" w:color="auto"/>
+              <w:right w:val="single" w:sz="4" w:space="0" w:color="auto"/>
+            </w:tcBorders>
+            <w:shd w:val="clear" w:color="auto" w:fill="A6A6A6"/>
+            <w:vAlign w:val="center"/>
+          </w:tcPr>
+          <w:p>
+            <w:pPr>
+              <w:widowControl w:val="0"/>
+              <w:autoSpaceDE w:val="0"/>
+              <w:autoSpaceDN w:val="0"/>
+              <w:bidi w:val="0"/>
+              <w:jc w:val="center"/>
+              <w:rPr>
+                <w:rFonts w:asciiTheme="majorBidi" w:eastAsia="Times New Roman" w:hAnsiTheme="majorBidi" w:cstheme="majorBidi"/>
+                <w:kern w:val="0"/>
+                <w:sz w:val="16"/>
+                <w:szCs w:val="16"/>
+                <w14:ligatures w14:val="none"/>
+              </w:rPr>
+            </w:pPr>
+            <w:r>
+              <w:rPr>
+                <w:rFonts w:asciiTheme="majorBidi" w:eastAsia="Times New Roman" w:hAnsiTheme="majorBidi" w:cstheme="majorBidi"/>
+                <w:kern w:val="0"/>
+                <w:sz w:val="16"/>
+                <w:szCs w:val="16"/>
+                <w14:ligatures w14:val="none"/>
+              </w:rPr>
+              <w:t>Dr. Fatimah (3pm-11pm)</w:t>
             </w:r>
           </w:p>
         </w:tc>
@@ -12121,17 +12885,7 @@
                 <w:szCs w:val="16"/>
                 <w14:ligatures w14:val="none"/>
               </w:rPr>
-              <w:t/>
-            </w:r>
-            <w:r>
-              <w:rPr>
-                <w:rFonts w:ascii="Times New Roman" w:eastAsia="Times New Roman" w:hAnsi="Times New Roman" w:cs="Times New Roman"/>
-                <w:kern w:val="0"/>
-                <w:sz w:val="16"/>
-                <w:szCs w:val="16"/>
-                <w14:ligatures w14:val="none"/>
-              </w:rPr>
-              <w:t xml:space="preserve"/>
+              <w:t>Dr. Ghanima</w:t>
             </w:r>
           </w:p>
         </w:tc>
@@ -12169,7 +12923,7 @@
                 <w:szCs w:val="16"/>
                 <w14:ligatures w14:val="none"/>
               </w:rPr>
-              <w:t/>
+              <w:t>Dr. Mohammed.O</w:t>
             </w:r>
           </w:p>
         </w:tc>
@@ -12207,7 +12961,7 @@
                 <w:szCs w:val="16"/>
                 <w14:ligatures w14:val="none"/>
               </w:rPr>
-              <w:t/>
+              <w:t>Dr. Mohammed.S</w:t>
             </w:r>
           </w:p>
         </w:tc>
@@ -12245,7 +12999,7 @@
                 <w:szCs w:val="16"/>
                 <w14:ligatures w14:val="none"/>
               </w:rPr>
-              <w:t/>
+              <w:t>Dr. Saeed</w:t>
             </w:r>
           </w:p>
         </w:tc>
@@ -12284,7 +13038,7 @@
                 <w:szCs w:val="16"/>
                 <w14:ligatures w14:val="none"/>
               </w:rPr>
-              <w:t/>
+              <w:t>Dr. Sadiq</w:t>
             </w:r>
           </w:p>
         </w:tc>
@@ -12323,7 +13077,7 @@
                 <w:szCs w:val="16"/>
                 <w14:ligatures w14:val="none"/>
               </w:rPr>
-              <w:t/>
+              <w:t>Dr. Alsultan</w:t>
             </w:r>
           </w:p>
         </w:tc>
@@ -12471,17 +13225,7 @@
                 <w:szCs w:val="16"/>
                 <w14:ligatures w14:val="none"/>
               </w:rPr>
-              <w:t/>
-            </w:r>
-            <w:r>
-              <w:rPr>
-                <w:rFonts w:ascii="Times New Roman" w:eastAsia="Times New Roman" w:hAnsi="Times New Roman" w:cs="Times New Roman"/>
-                <w:kern w:val="0"/>
-                <w:sz w:val="16"/>
-                <w:szCs w:val="16"/>
-                <w14:ligatures w14:val="none"/>
-              </w:rPr>
-              <w:t xml:space="preserve"/>
+              <w:t>Dr. Ghanima</w:t>
             </w:r>
           </w:p>
         </w:tc>
@@ -12519,7 +13263,7 @@
                 <w:szCs w:val="16"/>
                 <w14:ligatures w14:val="none"/>
               </w:rPr>
-              <w:t/>
+              <w:t>Dr. Mohammed.O</w:t>
             </w:r>
           </w:p>
         </w:tc>
@@ -12557,7 +13301,7 @@
                 <w:szCs w:val="16"/>
                 <w14:ligatures w14:val="none"/>
               </w:rPr>
-              <w:t/>
+              <w:t>Dr. Mohammed.S</w:t>
             </w:r>
           </w:p>
         </w:tc>
@@ -12595,7 +13339,7 @@
                 <w:szCs w:val="16"/>
                 <w14:ligatures w14:val="none"/>
               </w:rPr>
-              <w:t/>
+              <w:t>Dr. Fadel</w:t>
             </w:r>
           </w:p>
         </w:tc>
@@ -12634,7 +13378,7 @@
                 <w:szCs w:val="16"/>
                 <w14:ligatures w14:val="none"/>
               </w:rPr>
-              <w:t/>
+              <w:t>Dr. Sadiq</w:t>
             </w:r>
           </w:p>
         </w:tc>
@@ -12673,7 +13417,7 @@
                 <w:szCs w:val="16"/>
                 <w14:ligatures w14:val="none"/>
               </w:rPr>
-              <w:t/>
+              <w:t>Dr. Abdulrahim</w:t>
             </w:r>
           </w:p>
         </w:tc>
@@ -12826,17 +13570,7 @@
                 <w:szCs w:val="16"/>
                 <w14:ligatures w14:val="none"/>
               </w:rPr>
-              <w:t/>
-            </w:r>
-            <w:r>
-              <w:rPr>
-                <w:rFonts w:ascii="Times New Roman" w:eastAsia="Times New Roman" w:hAnsi="Times New Roman" w:cs="Times New Roman"/>
-                <w:kern w:val="0"/>
-                <w:sz w:val="16"/>
-                <w:szCs w:val="16"/>
-                <w14:ligatures w14:val="none"/>
-              </w:rPr>
-              <w:t xml:space="preserve"/>
+              <w:t>Dr. Ghanima</w:t>
             </w:r>
           </w:p>
         </w:tc>
@@ -12874,7 +13608,7 @@
                 <w:szCs w:val="16"/>
                 <w14:ligatures w14:val="none"/>
               </w:rPr>
-              <w:t/>
+              <w:t>Dr. Mohammed.O</w:t>
             </w:r>
           </w:p>
         </w:tc>
@@ -12912,7 +13646,7 @@
                 <w:szCs w:val="16"/>
                 <w14:ligatures w14:val="none"/>
               </w:rPr>
-              <w:t/>
+              <w:t>Dr. Mohammed.S</w:t>
             </w:r>
           </w:p>
         </w:tc>
@@ -12950,7 +13684,7 @@
                 <w:szCs w:val="16"/>
                 <w14:ligatures w14:val="none"/>
               </w:rPr>
-              <w:t/>
+              <w:t>Dr. Saeed</w:t>
             </w:r>
           </w:p>
         </w:tc>
@@ -12989,7 +13723,7 @@
                 <w:szCs w:val="16"/>
                 <w14:ligatures w14:val="none"/>
               </w:rPr>
-              <w:t/>
+              <w:t>Dr. Fatimah</w:t>
             </w:r>
           </w:p>
         </w:tc>
@@ -13028,7 +13762,7 @@
                 <w:szCs w:val="16"/>
                 <w14:ligatures w14:val="none"/>
               </w:rPr>
-              <w:t/>
+              <w:t>Dr. Sadiq</w:t>
             </w:r>
           </w:p>
         </w:tc>
@@ -13176,17 +13910,7 @@
                 <w:szCs w:val="16"/>
                 <w14:ligatures w14:val="none"/>
               </w:rPr>
-              <w:t/>
-            </w:r>
-            <w:r>
-              <w:rPr>
-                <w:rFonts w:ascii="Times New Roman" w:eastAsia="Times New Roman" w:hAnsi="Times New Roman" w:cs="Times New Roman"/>
-                <w:kern w:val="0"/>
-                <w:sz w:val="16"/>
-                <w:szCs w:val="16"/>
-                <w14:ligatures w14:val="none"/>
-              </w:rPr>
-              <w:t xml:space="preserve"/>
+              <w:t>Dr. Ghanima</w:t>
             </w:r>
           </w:p>
         </w:tc>
@@ -13224,7 +13948,7 @@
                 <w:szCs w:val="16"/>
                 <w14:ligatures w14:val="none"/>
               </w:rPr>
-              <w:t/>
+              <w:t>Dr. Mohammed.O</w:t>
             </w:r>
           </w:p>
         </w:tc>
@@ -13262,7 +13986,7 @@
                 <w:szCs w:val="16"/>
                 <w14:ligatures w14:val="none"/>
               </w:rPr>
-              <w:t/>
+              <w:t>Dr. Mohammed.S</w:t>
             </w:r>
           </w:p>
         </w:tc>
@@ -13300,7 +14024,7 @@
                 <w:szCs w:val="16"/>
                 <w14:ligatures w14:val="none"/>
               </w:rPr>
-              <w:t/>
+              <w:t>Dr. Abdullah</w:t>
             </w:r>
           </w:p>
         </w:tc>
@@ -13339,7 +14063,7 @@
                 <w:szCs w:val="16"/>
                 <w14:ligatures w14:val="none"/>
               </w:rPr>
-              <w:t/>
+              <w:t>Dr. Fatimah</w:t>
             </w:r>
           </w:p>
         </w:tc>
@@ -13378,7 +14102,7 @@
                 <w:szCs w:val="16"/>
                 <w14:ligatures w14:val="none"/>
               </w:rPr>
-              <w:t/>
+              <w:t>Dr. Alsultan (3pm-11pm)</w:t>
             </w:r>
           </w:p>
         </w:tc>
@@ -13526,17 +14250,7 @@
                 <w:szCs w:val="16"/>
                 <w14:ligatures w14:val="none"/>
               </w:rPr>
-              <w:t/>
-            </w:r>
-            <w:r>
-              <w:rPr>
-                <w:rFonts w:ascii="Times New Roman" w:eastAsia="Times New Roman" w:hAnsi="Times New Roman" w:cs="Times New Roman"/>
-                <w:kern w:val="0"/>
-                <w:sz w:val="16"/>
-                <w:szCs w:val="16"/>
-                <w14:ligatures w14:val="none"/>
-              </w:rPr>
-              <w:t xml:space="preserve"/>
+              <w:t>Dr. Ghanima</w:t>
             </w:r>
           </w:p>
         </w:tc>
@@ -13574,7 +14288,7 @@
                 <w:szCs w:val="16"/>
                 <w14:ligatures w14:val="none"/>
               </w:rPr>
-              <w:t/>
+              <w:t>Dr. Mohammed.O</w:t>
             </w:r>
           </w:p>
         </w:tc>
@@ -13612,7 +14326,7 @@
                 <w:szCs w:val="16"/>
                 <w14:ligatures w14:val="none"/>
               </w:rPr>
-              <w:t/>
+              <w:t>Dr. Mohammed.S</w:t>
             </w:r>
           </w:p>
         </w:tc>
@@ -13650,7 +14364,7 @@
                 <w:szCs w:val="16"/>
                 <w14:ligatures w14:val="none"/>
               </w:rPr>
-              <w:t/>
+              <w:t>Dr. Saeed</w:t>
             </w:r>
           </w:p>
         </w:tc>
@@ -13689,7 +14403,7 @@
                 <w:szCs w:val="16"/>
                 <w14:ligatures w14:val="none"/>
               </w:rPr>
-              <w:t/>
+              <w:t>Dr. Fatimah</w:t>
             </w:r>
           </w:p>
         </w:tc>
@@ -13728,7 +14442,7 @@
                 <w:szCs w:val="16"/>
                 <w14:ligatures w14:val="none"/>
               </w:rPr>
-              <w:t/>
+              <w:t>Dr. Abdulrahim</w:t>
             </w:r>
           </w:p>
         </w:tc>
@@ -13883,17 +14597,7 @@
                 <w:szCs w:val="16"/>
                 <w14:ligatures w14:val="none"/>
               </w:rPr>
-              <w:t/>
-            </w:r>
-            <w:r>
-              <w:rPr>
-                <w:rFonts w:ascii="Times New Roman" w:eastAsia="Times New Roman" w:hAnsi="Times New Roman" w:cs="Times New Roman"/>
-                <w:kern w:val="0"/>
-                <w:sz w:val="16"/>
-                <w:szCs w:val="16"/>
-                <w14:ligatures w14:val="none"/>
-              </w:rPr>
-              <w:t xml:space="preserve"/>
+              <w:t>Dr. Ghanima</w:t>
             </w:r>
           </w:p>
         </w:tc>
@@ -13933,7 +14637,7 @@
                 <w:szCs w:val="16"/>
                 <w14:ligatures w14:val="none"/>
               </w:rPr>
-              <w:t/>
+              <w:t>Dr. Mohammed.O</w:t>
             </w:r>
           </w:p>
         </w:tc>
@@ -14003,7 +14707,7 @@
                 <w:szCs w:val="16"/>
                 <w14:ligatures w14:val="none"/>
               </w:rPr>
-              <w:t/>
+              <w:t>Dr. Fadel</w:t>
             </w:r>
           </w:p>
         </w:tc>
@@ -14036,6 +14740,9 @@
                 <w14:ligatures w14:val="none"/>
               </w:rPr>
             </w:pPr>
+            <w:r>
+              <w:t>-</w:t>
+            </w:r>
           </w:p>
         </w:tc>
         <w:tc>
@@ -14075,7 +14782,7 @@
                 <w:szCs w:val="16"/>
                 <w14:ligatures w14:val="none"/>
               </w:rPr>
-              <w:t/>
+              <w:t>Dr. Fatimah (3pm-11pm)</w:t>
             </w:r>
           </w:p>
         </w:tc>
@@ -14229,17 +14936,7 @@
                 <w:szCs w:val="16"/>
                 <w14:ligatures w14:val="none"/>
               </w:rPr>
-              <w:t/>
-            </w:r>
-            <w:r>
-              <w:rPr>
-                <w:rFonts w:ascii="Times New Roman" w:eastAsia="Times New Roman" w:hAnsi="Times New Roman" w:cs="Times New Roman"/>
-                <w:kern w:val="0"/>
-                <w:sz w:val="16"/>
-                <w:szCs w:val="16"/>
-                <w14:ligatures w14:val="none"/>
-              </w:rPr>
-              <w:t xml:space="preserve"/>
+              <w:t>Dr. Ghanima</w:t>
             </w:r>
           </w:p>
         </w:tc>
@@ -14277,7 +14974,7 @@
                 <w:szCs w:val="16"/>
                 <w14:ligatures w14:val="none"/>
               </w:rPr>
-              <w:t/>
+              <w:t>Dr. Mohammed.O</w:t>
             </w:r>
           </w:p>
         </w:tc>
@@ -14343,7 +15040,7 @@
                 <w:szCs w:val="16"/>
                 <w14:ligatures w14:val="none"/>
               </w:rPr>
-              <w:t/>
+              <w:t>Dr. Saeed</w:t>
             </w:r>
           </w:p>
         </w:tc>
@@ -14375,6 +15072,9 @@
                 <w14:ligatures w14:val="none"/>
               </w:rPr>
             </w:pPr>
+            <w:r>
+              <w:t>-</w:t>
+            </w:r>
           </w:p>
         </w:tc>
         <w:tc>
@@ -14413,7 +15113,7 @@
                 <w:szCs w:val="16"/>
                 <w14:ligatures w14:val="none"/>
               </w:rPr>
-              <w:t/>
+              <w:t>Dr. Abdulrahim</w:t>
             </w:r>
           </w:p>
         </w:tc>
@@ -14561,17 +15261,7 @@
                 <w:szCs w:val="16"/>
                 <w14:ligatures w14:val="none"/>
               </w:rPr>
-              <w:t/>
-            </w:r>
-            <w:r>
-              <w:rPr>
-                <w:rFonts w:ascii="Times New Roman" w:eastAsia="Times New Roman" w:hAnsi="Times New Roman" w:cs="Times New Roman"/>
-                <w:kern w:val="0"/>
-                <w:sz w:val="16"/>
-                <w:szCs w:val="16"/>
-                <w14:ligatures w14:val="none"/>
-              </w:rPr>
-              <w:t xml:space="preserve"/>
+              <w:t>Dr. Mai</w:t>
             </w:r>
           </w:p>
         </w:tc>
@@ -14610,7 +15300,7 @@
                 <w:szCs w:val="16"/>
                 <w14:ligatures w14:val="none"/>
               </w:rPr>
-              <w:t/>
+              <w:t>Dr. Mohammed.S</w:t>
             </w:r>
           </w:p>
         </w:tc>
@@ -14649,7 +15339,7 @@
                 <w:szCs w:val="16"/>
                 <w14:ligatures w14:val="none"/>
               </w:rPr>
-              <w:t/>
+              <w:t>Dr. Fadel</w:t>
             </w:r>
           </w:p>
         </w:tc>
@@ -14688,7 +15378,7 @@
                 <w:szCs w:val="16"/>
                 <w14:ligatures w14:val="none"/>
               </w:rPr>
-              <w:t/>
+              <w:t>Dr. Abdullah</w:t>
             </w:r>
           </w:p>
         </w:tc>
@@ -14727,7 +15417,7 @@
                 <w:szCs w:val="16"/>
                 <w14:ligatures w14:val="none"/>
               </w:rPr>
-              <w:t/>
+              <w:t>Dr. Fatimah</w:t>
             </w:r>
           </w:p>
         </w:tc>
@@ -14766,7 +15456,7 @@
                 <w:szCs w:val="16"/>
                 <w14:ligatures w14:val="none"/>
               </w:rPr>
-              <w:t/>
+              <w:t>Dr. Alsultan (3pm-11pm)</w:t>
             </w:r>
           </w:p>
         </w:tc>
@@ -14916,17 +15606,7 @@
                 <w:szCs w:val="16"/>
                 <w14:ligatures w14:val="none"/>
               </w:rPr>
-              <w:t/>
-            </w:r>
-            <w:r>
-              <w:rPr>
-                <w:rFonts w:ascii="Times New Roman" w:eastAsia="Times New Roman" w:hAnsi="Times New Roman" w:cs="Times New Roman"/>
-                <w:kern w:val="0"/>
-                <w:sz w:val="16"/>
-                <w:szCs w:val="16"/>
-                <w14:ligatures w14:val="none"/>
-              </w:rPr>
-              <w:t xml:space="preserve"/>
+              <w:t>Dr. Mai</w:t>
             </w:r>
           </w:p>
         </w:tc>
@@ -14964,7 +15644,7 @@
                 <w:szCs w:val="16"/>
                 <w14:ligatures w14:val="none"/>
               </w:rPr>
-              <w:t/>
+              <w:t>Dr. Mohammed.S</w:t>
             </w:r>
           </w:p>
         </w:tc>
@@ -15002,7 +15682,7 @@
                 <w:szCs w:val="16"/>
                 <w14:ligatures w14:val="none"/>
               </w:rPr>
-              <w:t/>
+              <w:t>Dr. Fadel</w:t>
             </w:r>
           </w:p>
         </w:tc>
@@ -15040,7 +15720,7 @@
                 <w:szCs w:val="16"/>
                 <w14:ligatures w14:val="none"/>
               </w:rPr>
-              <w:t/>
+              <w:t>Dr. Saeed</w:t>
             </w:r>
           </w:p>
         </w:tc>
@@ -15079,7 +15759,7 @@
                 <w:szCs w:val="16"/>
                 <w14:ligatures w14:val="none"/>
               </w:rPr>
-              <w:t/>
+              <w:t>Dr. Fatimah</w:t>
             </w:r>
           </w:p>
         </w:tc>
@@ -15118,7 +15798,7 @@
                 <w:szCs w:val="16"/>
                 <w14:ligatures w14:val="none"/>
               </w:rPr>
-              <w:t/>
+              <w:t>Dr. Abdulrahim</w:t>
             </w:r>
           </w:p>
         </w:tc>
@@ -15268,17 +15948,7 @@
                 <w:szCs w:val="16"/>
                 <w14:ligatures w14:val="none"/>
               </w:rPr>
-              <w:t/>
-            </w:r>
-            <w:r>
-              <w:rPr>
-                <w:rFonts w:ascii="Times New Roman" w:eastAsia="Times New Roman" w:hAnsi="Times New Roman" w:cs="Times New Roman"/>
-                <w:kern w:val="0"/>
-                <w:sz w:val="16"/>
-                <w:szCs w:val="16"/>
-                <w14:ligatures w14:val="none"/>
-              </w:rPr>
-              <w:t xml:space="preserve"/>
+              <w:t>Dr. Mai</w:t>
             </w:r>
           </w:p>
         </w:tc>
@@ -15316,7 +15986,7 @@
                 <w:szCs w:val="16"/>
                 <w14:ligatures w14:val="none"/>
               </w:rPr>
-              <w:t/>
+              <w:t>Dr. Mohammed.S</w:t>
             </w:r>
           </w:p>
         </w:tc>
@@ -15354,7 +16024,7 @@
                 <w:szCs w:val="16"/>
                 <w14:ligatures w14:val="none"/>
               </w:rPr>
-              <w:t/>
+              <w:t>Dr. Fadel</w:t>
             </w:r>
           </w:p>
         </w:tc>
@@ -15392,7 +16062,7 @@
                 <w:szCs w:val="16"/>
                 <w14:ligatures w14:val="none"/>
               </w:rPr>
-              <w:t/>
+              <w:t>Dr. Mohammed.O</w:t>
             </w:r>
           </w:p>
         </w:tc>
@@ -15431,7 +16101,7 @@
                 <w:szCs w:val="16"/>
                 <w14:ligatures w14:val="none"/>
               </w:rPr>
-              <w:t/>
+              <w:t>-</w:t>
             </w:r>
           </w:p>
         </w:tc>
@@ -15470,7 +16140,7 @@
                 <w:szCs w:val="16"/>
                 <w14:ligatures w14:val="none"/>
               </w:rPr>
-              <w:t/>
+              <w:t>Dr. Sadiq (3pm-11pm)</w:t>
             </w:r>
           </w:p>
         </w:tc>
@@ -15620,17 +16290,7 @@
                 <w:szCs w:val="16"/>
                 <w14:ligatures w14:val="none"/>
               </w:rPr>
-              <w:t/>
-            </w:r>
-            <w:r>
-              <w:rPr>
-                <w:rFonts w:ascii="Times New Roman" w:eastAsia="Times New Roman" w:hAnsi="Times New Roman" w:cs="Times New Roman"/>
-                <w:kern w:val="0"/>
-                <w:sz w:val="16"/>
-                <w:szCs w:val="16"/>
-                <w14:ligatures w14:val="none"/>
-              </w:rPr>
-              <w:t xml:space="preserve"/>
+              <w:t>Dr. Mai</w:t>
             </w:r>
           </w:p>
         </w:tc>
@@ -15669,7 +16329,7 @@
                 <w:szCs w:val="16"/>
                 <w14:ligatures w14:val="none"/>
               </w:rPr>
-              <w:t/>
+              <w:t>Dr. Mohammed.S</w:t>
             </w:r>
           </w:p>
         </w:tc>
@@ -15708,7 +16368,7 @@
                 <w:szCs w:val="16"/>
                 <w14:ligatures w14:val="none"/>
               </w:rPr>
-              <w:t/>
+              <w:t>Dr. Fadel</w:t>
             </w:r>
           </w:p>
         </w:tc>
@@ -15746,7 +16406,7 @@
                 <w:szCs w:val="16"/>
                 <w14:ligatures w14:val="none"/>
               </w:rPr>
-              <w:t/>
+              <w:t>Dr. Saeed</w:t>
             </w:r>
           </w:p>
         </w:tc>
@@ -15785,7 +16445,7 @@
                 <w:szCs w:val="16"/>
                 <w14:ligatures w14:val="none"/>
               </w:rPr>
-              <w:t/>
+              <w:t>Dr. Fatimah</w:t>
             </w:r>
           </w:p>
         </w:tc>
@@ -15824,7 +16484,7 @@
                 <w:szCs w:val="16"/>
                 <w14:ligatures w14:val="none"/>
               </w:rPr>
-              <w:t/>
+              <w:t>Dr. Abdulrahim</w:t>
             </w:r>
           </w:p>
         </w:tc>
@@ -15979,17 +16639,7 @@
                 <w:szCs w:val="16"/>
                 <w14:ligatures w14:val="none"/>
               </w:rPr>
-              <w:t/>
-            </w:r>
-            <w:r>
-              <w:rPr>
-                <w:rFonts w:ascii="Times New Roman" w:eastAsia="Times New Roman" w:hAnsi="Times New Roman" w:cs="Times New Roman"/>
-                <w:kern w:val="0"/>
-                <w:sz w:val="16"/>
-                <w:szCs w:val="16"/>
-                <w14:ligatures w14:val="none"/>
-              </w:rPr>
-              <w:t xml:space="preserve"/>
+              <w:t>Dr. Mai</w:t>
             </w:r>
           </w:p>
         </w:tc>
@@ -16027,7 +16677,7 @@
                 <w:szCs w:val="16"/>
                 <w14:ligatures w14:val="none"/>
               </w:rPr>
-              <w:t/>
+              <w:t>Dr. Mohammed.S</w:t>
             </w:r>
           </w:p>
         </w:tc>
@@ -16065,7 +16715,7 @@
                 <w:szCs w:val="16"/>
                 <w14:ligatures w14:val="none"/>
               </w:rPr>
-              <w:t/>
+              <w:t>Dr. Fadel</w:t>
             </w:r>
           </w:p>
         </w:tc>
@@ -16103,7 +16753,7 @@
                 <w:szCs w:val="16"/>
                 <w14:ligatures w14:val="none"/>
               </w:rPr>
-              <w:t/>
+              <w:t>Dr. Abdullah</w:t>
             </w:r>
           </w:p>
         </w:tc>
@@ -16142,7 +16792,7 @@
                 <w:szCs w:val="16"/>
                 <w14:ligatures w14:val="none"/>
               </w:rPr>
-              <w:t/>
+              <w:t>Dr. Fatimah</w:t>
             </w:r>
           </w:p>
         </w:tc>
@@ -16181,7 +16831,7 @@
                 <w:szCs w:val="16"/>
                 <w14:ligatures w14:val="none"/>
               </w:rPr>
-              <w:t/>
+              <w:t>Dr. Sadiq (3pm-11pm)</w:t>
             </w:r>
           </w:p>
         </w:tc>
@@ -16341,17 +16991,7 @@
                 <w:szCs w:val="16"/>
                 <w14:ligatures w14:val="none"/>
               </w:rPr>
-              <w:t/>
-            </w:r>
-            <w:r>
-              <w:rPr>
-                <w:rFonts w:ascii="Times New Roman" w:eastAsia="Times New Roman" w:hAnsi="Times New Roman" w:cs="Times New Roman"/>
-                <w:kern w:val="0"/>
-                <w:sz w:val="16"/>
-                <w:szCs w:val="16"/>
-                <w14:ligatures w14:val="none"/>
-              </w:rPr>
-              <w:t xml:space="preserve"/>
+              <w:t>Dr. Mai</w:t>
             </w:r>
           </w:p>
         </w:tc>
@@ -16390,7 +17030,7 @@
                 <w:szCs w:val="16"/>
                 <w14:ligatures w14:val="none"/>
               </w:rPr>
-              <w:t/>
+              <w:t>Dr. Mohammed.S</w:t>
             </w:r>
           </w:p>
         </w:tc>
@@ -16458,7 +17098,7 @@
                 <w:szCs w:val="16"/>
                 <w14:ligatures w14:val="none"/>
               </w:rPr>
-              <w:t/>
+              <w:t>Dr. Saeed</w:t>
             </w:r>
           </w:p>
           <w:p>
@@ -16506,6 +17146,9 @@
                 <w14:ligatures w14:val="none"/>
               </w:rPr>
             </w:pPr>
+            <w:r>
+              <w:t>-</w:t>
+            </w:r>
           </w:p>
         </w:tc>
         <w:tc>
@@ -16544,7 +17187,7 @@
                 <w:szCs w:val="16"/>
                 <w14:ligatures w14:val="none"/>
               </w:rPr>
-              <w:t/>
+              <w:t>Dr. Fatimah (3pm-11pm)</w:t>
             </w:r>
           </w:p>
         </w:tc>
@@ -16702,17 +17345,7 @@
                 <w:szCs w:val="16"/>
                 <w14:ligatures w14:val="none"/>
               </w:rPr>
-              <w:t/>
-            </w:r>
-            <w:r>
-              <w:rPr>
-                <w:rFonts w:ascii="Times New Roman" w:eastAsia="Times New Roman" w:hAnsi="Times New Roman" w:cs="Times New Roman"/>
-                <w:kern w:val="0"/>
-                <w:sz w:val="16"/>
-                <w:szCs w:val="16"/>
-                <w14:ligatures w14:val="none"/>
-              </w:rPr>
-              <w:t xml:space="preserve"/>
+              <w:t>Dr. Mai</w:t>
             </w:r>
           </w:p>
         </w:tc>
@@ -16750,7 +17383,7 @@
                 <w:szCs w:val="16"/>
                 <w14:ligatures w14:val="none"/>
               </w:rPr>
-              <w:t/>
+              <w:t>Dr. Mohammed.S</w:t>
             </w:r>
           </w:p>
         </w:tc>
@@ -16816,7 +17449,7 @@
                 <w:szCs w:val="16"/>
                 <w14:ligatures w14:val="none"/>
               </w:rPr>
-              <w:t/>
+              <w:t>Dr. Fadel</w:t>
             </w:r>
           </w:p>
         </w:tc>
@@ -16847,6 +17480,9 @@
                 <w14:ligatures w14:val="none"/>
               </w:rPr>
             </w:pPr>
+            <w:r>
+              <w:t>-</w:t>
+            </w:r>
           </w:p>
         </w:tc>
         <w:tc>
@@ -16884,7 +17520,7 @@
                 <w:szCs w:val="16"/>
                 <w14:ligatures w14:val="none"/>
               </w:rPr>
-              <w:t/>
+              <w:t>Dr. Sadiq</w:t>
             </w:r>
           </w:p>
         </w:tc>
@@ -17032,17 +17668,7 @@
                 <w:szCs w:val="16"/>
                 <w14:ligatures w14:val="none"/>
               </w:rPr>
-              <w:t/>
-            </w:r>
-            <w:r>
-              <w:rPr>
-                <w:rFonts w:ascii="Times New Roman" w:eastAsia="Times New Roman" w:hAnsi="Times New Roman" w:cs="Times New Roman"/>
-                <w:kern w:val="0"/>
-                <w:sz w:val="16"/>
-                <w:szCs w:val="16"/>
-                <w14:ligatures w14:val="none"/>
-              </w:rPr>
-              <w:t/>
+              <w:t>Dr. Aminah</w:t>
             </w:r>
           </w:p>
         </w:tc>
@@ -17080,7 +17706,7 @@
                 <w:szCs w:val="16"/>
                 <w14:ligatures w14:val="none"/>
               </w:rPr>
-              <w:t/>
+              <w:t>Dr. Abdullah</w:t>
             </w:r>
           </w:p>
         </w:tc>
@@ -17118,7 +17744,7 @@
                 <w:szCs w:val="16"/>
                 <w14:ligatures w14:val="none"/>
               </w:rPr>
-              <w:t/>
+              <w:t>Dr. Mohammed.O</w:t>
             </w:r>
           </w:p>
         </w:tc>
@@ -17156,7 +17782,7 @@
                 <w:szCs w:val="16"/>
                 <w14:ligatures w14:val="none"/>
               </w:rPr>
-              <w:t/>
+              <w:t>Dr. Saeed</w:t>
             </w:r>
           </w:p>
         </w:tc>
@@ -17195,7 +17821,7 @@
                 <w:szCs w:val="16"/>
                 <w14:ligatures w14:val="none"/>
               </w:rPr>
-              <w:t/>
+              <w:t>Dr. Fatimah</w:t>
             </w:r>
           </w:p>
         </w:tc>
@@ -17234,7 +17860,7 @@
                 <w:szCs w:val="16"/>
                 <w14:ligatures w14:val="none"/>
               </w:rPr>
-              <w:t/>
+              <w:t>Dr. Alsultan</w:t>
             </w:r>
           </w:p>
         </w:tc>
@@ -17387,17 +18013,7 @@
                 <w:szCs w:val="16"/>
                 <w14:ligatures w14:val="none"/>
               </w:rPr>
-              <w:t/>
-            </w:r>
-            <w:r>
-              <w:rPr>
-                <w:rFonts w:ascii="Times New Roman" w:eastAsia="Times New Roman" w:hAnsi="Times New Roman" w:cs="Times New Roman"/>
-                <w:kern w:val="0"/>
-                <w:sz w:val="16"/>
-                <w:szCs w:val="16"/>
-                <w14:ligatures w14:val="none"/>
-              </w:rPr>
-              <w:t/>
+              <w:t>Dr. Aminah</w:t>
             </w:r>
           </w:p>
         </w:tc>
@@ -17435,7 +18051,7 @@
                 <w:szCs w:val="16"/>
                 <w14:ligatures w14:val="none"/>
               </w:rPr>
-              <w:t/>
+              <w:t>Dr. Abdullah</w:t>
             </w:r>
           </w:p>
         </w:tc>
@@ -17473,7 +18089,7 @@
                 <w:szCs w:val="16"/>
                 <w14:ligatures w14:val="none"/>
               </w:rPr>
-              <w:t/>
+              <w:t>Dr. Mohammed.O</w:t>
             </w:r>
           </w:p>
         </w:tc>
@@ -17511,7 +18127,7 @@
                 <w:szCs w:val="16"/>
                 <w14:ligatures w14:val="none"/>
               </w:rPr>
-              <w:t/>
+              <w:t>Dr. Fadel</w:t>
             </w:r>
           </w:p>
         </w:tc>
@@ -17550,7 +18166,7 @@
                 <w:szCs w:val="16"/>
                 <w14:ligatures w14:val="none"/>
               </w:rPr>
-              <w:t/>
+              <w:t>Dr. Fatimah Alkudhyr</w:t>
             </w:r>
           </w:p>
         </w:tc>
@@ -17589,7 +18205,7 @@
                 <w:szCs w:val="16"/>
                 <w14:ligatures w14:val="none"/>
               </w:rPr>
-              <w:t/>
+              <w:t>Dr. Abdulrahim</w:t>
             </w:r>
           </w:p>
         </w:tc>
@@ -17739,17 +18355,7 @@
                 <w:szCs w:val="16"/>
                 <w14:ligatures w14:val="none"/>
               </w:rPr>
-              <w:t/>
-            </w:r>
-            <w:r>
-              <w:rPr>
-                <w:rFonts w:ascii="Times New Roman" w:eastAsia="Times New Roman" w:hAnsi="Times New Roman" w:cs="Times New Roman"/>
-                <w:kern w:val="0"/>
-                <w:sz w:val="16"/>
-                <w:szCs w:val="16"/>
-                <w14:ligatures w14:val="none"/>
-              </w:rPr>
-              <w:t/>
+              <w:t>Dr. Aminah</w:t>
             </w:r>
           </w:p>
         </w:tc>
@@ -17787,7 +18393,7 @@
                 <w:szCs w:val="16"/>
                 <w14:ligatures w14:val="none"/>
               </w:rPr>
-              <w:t/>
+              <w:t>Dr. Abdullah</w:t>
             </w:r>
           </w:p>
         </w:tc>
@@ -17825,7 +18431,7 @@
                 <w:szCs w:val="16"/>
                 <w14:ligatures w14:val="none"/>
               </w:rPr>
-              <w:t/>
+              <w:t>Dr. Mohammed.O</w:t>
             </w:r>
           </w:p>
         </w:tc>
@@ -17863,7 +18469,7 @@
                 <w:szCs w:val="16"/>
                 <w14:ligatures w14:val="none"/>
               </w:rPr>
-              <w:t/>
+              <w:t>Dr. Saeed</w:t>
             </w:r>
           </w:p>
         </w:tc>
@@ -17902,7 +18508,7 @@
                 <w:szCs w:val="16"/>
                 <w14:ligatures w14:val="none"/>
               </w:rPr>
-              <w:t/>
+              <w:t>Dr. Fatimah Alkudhyr</w:t>
             </w:r>
           </w:p>
         </w:tc>
@@ -17941,7 +18547,7 @@
                 <w:szCs w:val="16"/>
                 <w14:ligatures w14:val="none"/>
               </w:rPr>
-              <w:t/>
+              <w:t>Dr. Alsultan (3pm-11pm)</w:t>
             </w:r>
           </w:p>
         </w:tc>
@@ -18096,17 +18702,7 @@
                 <w:szCs w:val="16"/>
                 <w14:ligatures w14:val="none"/>
               </w:rPr>
-              <w:t/>
-            </w:r>
-            <w:r>
-              <w:rPr>
-                <w:rFonts w:ascii="Times New Roman" w:eastAsia="Times New Roman" w:hAnsi="Times New Roman" w:cs="Times New Roman"/>
-                <w:kern w:val="0"/>
-                <w:sz w:val="16"/>
-                <w:szCs w:val="16"/>
-                <w14:ligatures w14:val="none"/>
-              </w:rPr>
-              <w:t/>
+              <w:t>Dr. Aminah</w:t>
             </w:r>
           </w:p>
         </w:tc>
@@ -18144,7 +18740,7 @@
                 <w:szCs w:val="16"/>
                 <w14:ligatures w14:val="none"/>
               </w:rPr>
-              <w:t/>
+              <w:t>Dr. Abdullah</w:t>
             </w:r>
           </w:p>
         </w:tc>
@@ -18182,7 +18778,7 @@
                 <w:szCs w:val="16"/>
                 <w14:ligatures w14:val="none"/>
               </w:rPr>
-              <w:t/>
+              <w:t>Dr. Mohammed.O</w:t>
             </w:r>
           </w:p>
         </w:tc>
@@ -18220,7 +18816,7 @@
                 <w:szCs w:val="16"/>
                 <w14:ligatures w14:val="none"/>
               </w:rPr>
-              <w:t/>
+              <w:t>Dr. Mohammed.S</w:t>
             </w:r>
           </w:p>
         </w:tc>
@@ -18259,7 +18855,7 @@
                 <w:szCs w:val="16"/>
                 <w14:ligatures w14:val="none"/>
               </w:rPr>
-              <w:t/>
+              <w:t>Dr. Fatimah</w:t>
             </w:r>
           </w:p>
         </w:tc>
@@ -18298,7 +18894,7 @@
                 <w:szCs w:val="16"/>
                 <w14:ligatures w14:val="none"/>
               </w:rPr>
-              <w:t/>
+              <w:t>Dr. Fatimah Alkudhyr</w:t>
             </w:r>
           </w:p>
         </w:tc>
@@ -18453,17 +19049,7 @@
                 <w:szCs w:val="16"/>
                 <w14:ligatures w14:val="none"/>
               </w:rPr>
-              <w:t/>
-            </w:r>
-            <w:r>
-              <w:rPr>
-                <w:rFonts w:ascii="Times New Roman" w:eastAsia="Times New Roman" w:hAnsi="Times New Roman" w:cs="Times New Roman"/>
-                <w:kern w:val="0"/>
-                <w:sz w:val="16"/>
-                <w:szCs w:val="16"/>
-                <w14:ligatures w14:val="none"/>
-              </w:rPr>
-              <w:t/>
+              <w:t>Dr. Aminah</w:t>
             </w:r>
           </w:p>
         </w:tc>
@@ -18501,7 +19087,7 @@
                 <w:szCs w:val="16"/>
                 <w14:ligatures w14:val="none"/>
               </w:rPr>
-              <w:t/>
+              <w:t>Dr. Abdullah</w:t>
             </w:r>
           </w:p>
         </w:tc>
@@ -18539,7 +19125,7 @@
                 <w:szCs w:val="16"/>
                 <w14:ligatures w14:val="none"/>
               </w:rPr>
-              <w:t/>
+              <w:t>Dr. Mohammed.O</w:t>
             </w:r>
           </w:p>
         </w:tc>
@@ -18577,7 +19163,7 @@
                 <w:szCs w:val="16"/>
                 <w14:ligatures w14:val="none"/>
               </w:rPr>
-              <w:t/>
+              <w:t>Dr. Fadel</w:t>
             </w:r>
           </w:p>
         </w:tc>
@@ -18616,7 +19202,7 @@
                 <w:szCs w:val="16"/>
                 <w14:ligatures w14:val="none"/>
               </w:rPr>
-              <w:t/>
+              <w:t>Dr. Fatimah</w:t>
             </w:r>
           </w:p>
         </w:tc>
@@ -18655,7 +19241,7 @@
                 <w:szCs w:val="16"/>
                 <w14:ligatures w14:val="none"/>
               </w:rPr>
-              <w:t/>
+              <w:t>Dr. Alsultan</w:t>
             </w:r>
           </w:p>
         </w:tc>
@@ -18811,17 +19397,7 @@
                 <w:szCs w:val="16"/>
                 <w14:ligatures w14:val="none"/>
               </w:rPr>
-              <w:t/>
-            </w:r>
-            <w:r>
-              <w:rPr>
-                <w:rFonts w:ascii="Times New Roman" w:eastAsia="Times New Roman" w:hAnsi="Times New Roman" w:cs="Times New Roman"/>
-                <w:kern w:val="0"/>
-                <w:sz w:val="16"/>
-                <w:szCs w:val="16"/>
-                <w14:ligatures w14:val="none"/>
-              </w:rPr>
-              <w:t/>
+              <w:t>Dr. Aminah</w:t>
             </w:r>
           </w:p>
         </w:tc>
@@ -18860,7 +19436,7 @@
                 <w:szCs w:val="16"/>
                 <w14:ligatures w14:val="none"/>
               </w:rPr>
-              <w:t/>
+              <w:t>Dr. Abdullah</w:t>
             </w:r>
           </w:p>
         </w:tc>
@@ -18928,7 +19504,7 @@
                 <w:szCs w:val="16"/>
                 <w14:ligatures w14:val="none"/>
               </w:rPr>
-              <w:t/>
+              <w:t>Dr. Iman</w:t>
             </w:r>
           </w:p>
         </w:tc>
@@ -18960,6 +19536,9 @@
                 <w14:ligatures w14:val="none"/>
               </w:rPr>
             </w:pPr>
+            <w:r>
+              <w:t>-</w:t>
+            </w:r>
           </w:p>
         </w:tc>
         <w:tc>
@@ -18998,7 +19577,7 @@
                 <w:szCs w:val="16"/>
                 <w14:ligatures w14:val="none"/>
               </w:rPr>
-              <w:t/>
+              <w:t>Dr. Fatimah (3pm-11pm)</w:t>
             </w:r>
           </w:p>
         </w:tc>
@@ -19154,17 +19733,7 @@
                 <w:szCs w:val="16"/>
                 <w14:ligatures w14:val="none"/>
               </w:rPr>
-              <w:t/>
-            </w:r>
-            <w:r>
-              <w:rPr>
-                <w:rFonts w:ascii="Times New Roman" w:eastAsia="Times New Roman" w:hAnsi="Times New Roman" w:cs="Times New Roman"/>
-                <w:kern w:val="0"/>
-                <w:sz w:val="16"/>
-                <w:szCs w:val="16"/>
-                <w14:ligatures w14:val="none"/>
-              </w:rPr>
-              <w:t/>
+              <w:t>Dr. Aminah</w:t>
             </w:r>
           </w:p>
         </w:tc>
@@ -19203,7 +19772,7 @@
                 <w:szCs w:val="16"/>
                 <w14:ligatures w14:val="none"/>
               </w:rPr>
-              <w:t/>
+              <w:t>Dr. Abdullah</w:t>
             </w:r>
           </w:p>
         </w:tc>
@@ -19271,7 +19840,7 @@
                 <w:szCs w:val="16"/>
                 <w14:ligatures w14:val="none"/>
               </w:rPr>
-              <w:t/>
+              <w:t>Dr. Mohammed.O</w:t>
             </w:r>
           </w:p>
         </w:tc>
@@ -19303,6 +19872,9 @@
                 <w14:ligatures w14:val="none"/>
               </w:rPr>
             </w:pPr>
+            <w:r>
+              <w:t>-</w:t>
+            </w:r>
           </w:p>
         </w:tc>
         <w:tc>
@@ -19341,7 +19913,7 @@
                 <w:szCs w:val="16"/>
                 <w14:ligatures w14:val="none"/>
               </w:rPr>
-              <w:t xml:space="preserve"/>
+              <w:t>Dr. Sadiq</w:t>
             </w:r>
             <w:proofErr w:type="gramStart"/>
             <w:r>
@@ -19352,7 +19924,6 @@
                 <w:szCs w:val="16"/>
                 <w14:ligatures w14:val="none"/>
               </w:rPr>
-              <w:t/>
             </w:r>
             <w:proofErr w:type="gramEnd"/>
             <w:r>
@@ -19363,7 +19934,6 @@
                 <w:szCs w:val="16"/>
                 <w14:ligatures w14:val="none"/>
               </w:rPr>
-              <w:t/>
             </w:r>
           </w:p>
         </w:tc>

</xml_diff>